<commit_message>
Update de evidencias indiv. Mateo
</commit_message>
<xml_diff>
--- a/Fase 1/Evidencias Individuales/Alvarez_Mateo_1.1_APT122_AutoevaluacionCompetenciasFase1.docx
+++ b/Fase 1/Evidencias Individuales/Alvarez_Mateo_1.1_APT122_AutoevaluacionCompetenciasFase1.docx
@@ -1,6 +1,6 @@
 
 <file path=word/document.xml><?xml version="1.0" encoding="utf-8"?>
-<w:document xmlns:wpc="http://schemas.microsoft.com/office/word/2010/wordprocessingCanvas" xmlns:cx="http://schemas.microsoft.com/office/drawing/2014/chartex" xmlns:cx1="http://schemas.microsoft.com/office/drawing/2015/9/8/chartex" xmlns:cx2="http://schemas.microsoft.com/office/drawing/2015/10/21/chartex" xmlns:cx3="http://schemas.microsoft.com/office/drawing/2016/5/9/chartex" xmlns:cx4="http://schemas.microsoft.com/office/drawing/2016/5/10/chartex" xmlns:cx5="http://schemas.microsoft.com/office/drawing/2016/5/11/chartex" xmlns:cx6="http://schemas.microsoft.com/office/drawing/2016/5/12/chartex" xmlns:cx7="http://schemas.microsoft.com/office/drawing/2016/5/13/chartex" xmlns:cx8="http://schemas.microsoft.com/office/drawing/2016/5/14/chartex" xmlns:mc="http://schemas.openxmlformats.org/markup-compatibility/2006" xmlns:aink="http://schemas.microsoft.com/office/drawing/2016/ink" xmlns:am3d="http://schemas.microsoft.com/office/drawing/2017/model3d" xmlns:o="urn:schemas-microsoft-com:office:office" xmlns:oel="http://schemas.microsoft.com/office/2019/extlst" xmlns:r="http://schemas.openxmlformats.org/officeDocument/2006/relationships" xmlns:m="http://schemas.openxmlformats.org/officeDocument/2006/math" xmlns:v="urn:schemas-microsoft-com:vml" xmlns:wp14="http://schemas.microsoft.com/office/word/2010/wordprocessingDrawing" xmlns:wp="http://schemas.openxmlformats.org/drawingml/2006/wordprocessingDrawing" xmlns:w10="urn:schemas-microsoft-com:office:word" xmlns:w="http://schemas.openxmlformats.org/wordprocessingml/2006/main" xmlns:w14="http://schemas.microsoft.com/office/word/2010/wordml" xmlns:w15="http://schemas.microsoft.com/office/word/2012/wordml" xmlns:w16cei="http://schemas.microsoft.com/office/word/2026/wordml/cei" xmlns:w16cex="http://schemas.microsoft.com/office/word/2018/wordml/cex" xmlns:w16cid="http://schemas.microsoft.com/office/word/2016/wordml/cid" xmlns:w16="http://schemas.microsoft.com/office/word/2018/wordml" xmlns:w16du="http://schemas.microsoft.com/office/word/2023/wordml/word16du" xmlns:w16sdtdh="http://schemas.microsoft.com/office/word/2020/wordml/sdtdatahash" xmlns:w16sdtfl="http://schemas.microsoft.com/office/word/2024/wordml/sdtformatlock" xmlns:w16se="http://schemas.microsoft.com/office/word/2015/wordml/symex" xmlns:wpg="http://schemas.microsoft.com/office/word/2010/wordprocessingGroup" xmlns:wpi="http://schemas.microsoft.com/office/word/2010/wordprocessingInk" xmlns:wne="http://schemas.microsoft.com/office/word/2006/wordml" xmlns:wps="http://schemas.microsoft.com/office/word/2010/wordprocessingShape" mc:Ignorable="w14 w15 w16se w16cid w16 w16cex w16sdtdh w16sdtfl w16du wp14">
+<w:document xmlns:wpc="http://schemas.microsoft.com/office/word/2010/wordprocessingCanvas" xmlns:cx="http://schemas.microsoft.com/office/drawing/2014/chartex" xmlns:cx1="http://schemas.microsoft.com/office/drawing/2015/9/8/chartex" xmlns:cx2="http://schemas.microsoft.com/office/drawing/2015/10/21/chartex" xmlns:cx3="http://schemas.microsoft.com/office/drawing/2016/5/9/chartex" xmlns:cx4="http://schemas.microsoft.com/office/drawing/2016/5/10/chartex" xmlns:cx5="http://schemas.microsoft.com/office/drawing/2016/5/11/chartex" xmlns:cx6="http://schemas.microsoft.com/office/drawing/2016/5/12/chartex" xmlns:cx7="http://schemas.microsoft.com/office/drawing/2016/5/13/chartex" xmlns:cx8="http://schemas.microsoft.com/office/drawing/2016/5/14/chartex" xmlns:mc="http://schemas.openxmlformats.org/markup-compatibility/2006" xmlns:aink="http://schemas.microsoft.com/office/drawing/2016/ink" xmlns:am3d="http://schemas.microsoft.com/office/drawing/2017/model3d" xmlns:o="urn:schemas-microsoft-com:office:office" xmlns:oel="http://schemas.microsoft.com/office/2019/extlst" xmlns:r="http://schemas.openxmlformats.org/officeDocument/2006/relationships" xmlns:m="http://schemas.openxmlformats.org/officeDocument/2006/math" xmlns:v="urn:schemas-microsoft-com:vml" xmlns:wp14="http://schemas.microsoft.com/office/word/2010/wordprocessingDrawing" xmlns:wp="http://schemas.openxmlformats.org/drawingml/2006/wordprocessingDrawing" xmlns:w10="urn:schemas-microsoft-com:office:word" xmlns:w="http://schemas.openxmlformats.org/wordprocessingml/2006/main" xmlns:w14="http://schemas.microsoft.com/office/word/2010/wordml" xmlns:w15="http://schemas.microsoft.com/office/word/2012/wordml" xmlns:w16cex="http://schemas.microsoft.com/office/word/2018/wordml/cex" xmlns:w16cid="http://schemas.microsoft.com/office/word/2016/wordml/cid" xmlns:w16="http://schemas.microsoft.com/office/word/2018/wordml" xmlns:w16du="http://schemas.microsoft.com/office/word/2023/wordml/word16du" xmlns:w16sdtdh="http://schemas.microsoft.com/office/word/2020/wordml/sdtdatahash" xmlns:w16sdtfl="http://schemas.microsoft.com/office/word/2024/wordml/sdtformatlock" xmlns:w16se="http://schemas.microsoft.com/office/word/2015/wordml/symex" xmlns:wpg="http://schemas.microsoft.com/office/word/2010/wordprocessingGroup" xmlns:wpi="http://schemas.microsoft.com/office/word/2010/wordprocessingInk" xmlns:wne="http://schemas.microsoft.com/office/word/2006/wordml" xmlns:wps="http://schemas.microsoft.com/office/word/2010/wordprocessingShape" mc:Ignorable="w14 w15 w16se w16cid w16 w16cex w16sdtdh w16sdtfl w16du wp14">
   <w:body>
     <w:p>
       <w:pPr>
@@ -191,25 +191,7 @@
           <w:sz w:val="24"/>
           <w:szCs w:val="24"/>
         </w:rPr>
-        <w:t xml:space="preserve">Piensa en tu proceso de aprendizaje durante el tiempo que has </w:t>
-      </w:r>
-      <w:proofErr w:type="gramStart"/>
-      <w:r>
-        <w:rPr>
-          <w:rFonts w:eastAsiaTheme="majorEastAsia"/>
-          <w:sz w:val="24"/>
-          <w:szCs w:val="24"/>
-        </w:rPr>
-        <w:t>estudiando</w:t>
-      </w:r>
-      <w:proofErr w:type="gramEnd"/>
-      <w:r>
-        <w:rPr>
-          <w:rFonts w:eastAsiaTheme="majorEastAsia"/>
-          <w:sz w:val="24"/>
-          <w:szCs w:val="24"/>
-        </w:rPr>
-        <w:t xml:space="preserve"> en Duoc UC y evalúa el nivel de logro que alcanzaste en cada competencia de tu plan de estudio. </w:t>
+        <w:t xml:space="preserve">Piensa en tu proceso de aprendizaje durante el tiempo que has estudiando en Duoc UC y evalúa el nivel de logro que alcanzaste en cada competencia de tu plan de estudio. </w:t>
       </w:r>
     </w:p>
     <w:p>
@@ -1318,11 +1300,39 @@
               <w:rPr>
                 <w:b/>
                 <w:bCs/>
-                <w:color w:val="FF0000"/>
-                <w:sz w:val="18"/>
-                <w:szCs w:val="18"/>
-              </w:rPr>
-            </w:pPr>
+                <w:sz w:val="18"/>
+                <w:szCs w:val="18"/>
+              </w:rPr>
+            </w:pPr>
+            <w:r>
+              <w:rPr>
+                <w:b/>
+                <w:bCs/>
+                <w:sz w:val="18"/>
+                <w:szCs w:val="18"/>
+              </w:rPr>
+              <w:t>Ofrecer propuestas de solución informática analizando de forma integral los procesos de acuerdo a los</w:t>
+            </w:r>
+          </w:p>
+          <w:p>
+            <w:pPr>
+              <w:jc w:val="center"/>
+              <w:rPr>
+                <w:b/>
+                <w:bCs/>
+                <w:sz w:val="18"/>
+                <w:szCs w:val="18"/>
+              </w:rPr>
+            </w:pPr>
+            <w:r>
+              <w:rPr>
+                <w:b/>
+                <w:bCs/>
+                <w:sz w:val="18"/>
+                <w:szCs w:val="18"/>
+              </w:rPr>
+              <w:t>requerimientos de la organización.</w:t>
+            </w:r>
           </w:p>
         </w:tc>
         <w:tc>
@@ -1339,6 +1349,15 @@
                 <w:szCs w:val="18"/>
               </w:rPr>
             </w:pPr>
+            <w:r>
+              <w:rPr>
+                <w:b/>
+                <w:bCs/>
+                <w:sz w:val="18"/>
+                <w:szCs w:val="18"/>
+              </w:rPr>
+              <w:t>X</w:t>
+            </w:r>
           </w:p>
         </w:tc>
         <w:tc>
@@ -1419,6 +1438,15 @@
                 <w:szCs w:val="18"/>
               </w:rPr>
             </w:pPr>
+            <w:r>
+              <w:rPr>
+                <w:b/>
+                <w:bCs/>
+                <w:sz w:val="18"/>
+                <w:szCs w:val="18"/>
+              </w:rPr>
+              <w:t>Porque considero que a lo largo de la carrera, he logrado analizar los procesos de acuerdo con los requerimientos.</w:t>
+            </w:r>
           </w:p>
         </w:tc>
       </w:tr>
@@ -1437,11 +1465,19 @@
               <w:rPr>
                 <w:b/>
                 <w:bCs/>
-                <w:color w:val="FF0000"/>
-                <w:sz w:val="18"/>
-                <w:szCs w:val="18"/>
-              </w:rPr>
-            </w:pPr>
+                <w:sz w:val="18"/>
+                <w:szCs w:val="18"/>
+              </w:rPr>
+            </w:pPr>
+            <w:r>
+              <w:rPr>
+                <w:b/>
+                <w:bCs/>
+                <w:sz w:val="18"/>
+                <w:szCs w:val="18"/>
+              </w:rPr>
+              <w:t>Desarrollar una solución de software utilizando técnicas que permitan sistematizar el proceso de desarrollo y mantenimiento, asegurando el logro de los objetivos.</w:t>
+            </w:r>
           </w:p>
         </w:tc>
         <w:tc>
@@ -1458,6 +1494,15 @@
                 <w:szCs w:val="18"/>
               </w:rPr>
             </w:pPr>
+            <w:r>
+              <w:rPr>
+                <w:b/>
+                <w:bCs/>
+                <w:sz w:val="18"/>
+                <w:szCs w:val="18"/>
+              </w:rPr>
+              <w:t>X</w:t>
+            </w:r>
           </w:p>
         </w:tc>
         <w:tc>
@@ -1538,6 +1583,15 @@
                 <w:szCs w:val="18"/>
               </w:rPr>
             </w:pPr>
+            <w:r>
+              <w:rPr>
+                <w:b/>
+                <w:bCs/>
+                <w:sz w:val="18"/>
+                <w:szCs w:val="18"/>
+              </w:rPr>
+              <w:t>Porque considero que soy más que capaz de desarrollar una solución de software.</w:t>
+            </w:r>
           </w:p>
         </w:tc>
       </w:tr>
@@ -1560,6 +1614,15 @@
                 <w:szCs w:val="18"/>
               </w:rPr>
             </w:pPr>
+            <w:r>
+              <w:rPr>
+                <w:b/>
+                <w:bCs/>
+                <w:sz w:val="18"/>
+                <w:szCs w:val="18"/>
+              </w:rPr>
+              <w:t>Construir Modelos de datos para soportar los requerimientos de la organización acuerdo a un diseño definido y escalable en el tiempo.</w:t>
+            </w:r>
           </w:p>
         </w:tc>
         <w:tc>
@@ -1576,6 +1639,15 @@
                 <w:szCs w:val="18"/>
               </w:rPr>
             </w:pPr>
+            <w:r>
+              <w:rPr>
+                <w:b/>
+                <w:bCs/>
+                <w:sz w:val="18"/>
+                <w:szCs w:val="18"/>
+              </w:rPr>
+              <w:t>X</w:t>
+            </w:r>
           </w:p>
         </w:tc>
         <w:tc>
@@ -1656,6 +1728,15 @@
                 <w:szCs w:val="18"/>
               </w:rPr>
             </w:pPr>
+            <w:r>
+              <w:rPr>
+                <w:b/>
+                <w:bCs/>
+                <w:sz w:val="18"/>
+                <w:szCs w:val="18"/>
+              </w:rPr>
+              <w:t>Porque es de lo que más me gusta y leí los libros de bases de datos.</w:t>
+            </w:r>
           </w:p>
         </w:tc>
       </w:tr>
@@ -1678,6 +1759,15 @@
                 <w:szCs w:val="18"/>
               </w:rPr>
             </w:pPr>
+            <w:r>
+              <w:rPr>
+                <w:b/>
+                <w:bCs/>
+                <w:sz w:val="18"/>
+                <w:szCs w:val="18"/>
+              </w:rPr>
+              <w:t>Programar consultas o rutinas para manipular información de una base de datos de acuerdo a los requerimientos de la organización.</w:t>
+            </w:r>
           </w:p>
         </w:tc>
         <w:tc>
@@ -1694,6 +1784,15 @@
                 <w:szCs w:val="18"/>
               </w:rPr>
             </w:pPr>
+            <w:r>
+              <w:rPr>
+                <w:b/>
+                <w:bCs/>
+                <w:sz w:val="18"/>
+                <w:szCs w:val="18"/>
+              </w:rPr>
+              <w:t>X</w:t>
+            </w:r>
           </w:p>
         </w:tc>
         <w:tc>
@@ -1774,6 +1873,15 @@
                 <w:szCs w:val="18"/>
               </w:rPr>
             </w:pPr>
+            <w:r>
+              <w:rPr>
+                <w:b/>
+                <w:bCs/>
+                <w:sz w:val="18"/>
+                <w:szCs w:val="18"/>
+              </w:rPr>
+              <w:t>Por la misma razón anterior.</w:t>
+            </w:r>
           </w:p>
         </w:tc>
       </w:tr>
@@ -1796,6 +1904,25 @@
                 <w:szCs w:val="18"/>
               </w:rPr>
             </w:pPr>
+            <w:r>
+              <w:rPr>
+                <w:b/>
+                <w:bCs/>
+                <w:sz w:val="18"/>
+                <w:szCs w:val="18"/>
+              </w:rPr>
+              <w:t xml:space="preserve">Construir programas y rutinas de variada complejidad para dar solución a requerimientos de la organización, acordes a tecnologías de mercado y utilizando </w:t>
+            </w:r>
+            <w:r>
+              <w:rPr>
+                <w:b/>
+                <w:bCs/>
+                <w:sz w:val="18"/>
+                <w:szCs w:val="18"/>
+              </w:rPr>
+              <w:lastRenderedPageBreak/>
+              <w:t>buenas prácticas de codificación.</w:t>
+            </w:r>
           </w:p>
         </w:tc>
         <w:tc>
@@ -1812,6 +1939,16 @@
                 <w:szCs w:val="18"/>
               </w:rPr>
             </w:pPr>
+            <w:r>
+              <w:rPr>
+                <w:b/>
+                <w:bCs/>
+                <w:sz w:val="18"/>
+                <w:szCs w:val="18"/>
+              </w:rPr>
+              <w:lastRenderedPageBreak/>
+              <w:t>X</w:t>
+            </w:r>
           </w:p>
         </w:tc>
         <w:tc>
@@ -1892,6 +2029,15 @@
                 <w:szCs w:val="18"/>
               </w:rPr>
             </w:pPr>
+            <w:r>
+              <w:rPr>
+                <w:b/>
+                <w:bCs/>
+                <w:sz w:val="18"/>
+                <w:szCs w:val="18"/>
+              </w:rPr>
+              <w:t>Siento que a lol largo de la carrera, he logrado construir soluciones informáticas que solucionan problemas, en general de alta complejidad.</w:t>
+            </w:r>
           </w:p>
         </w:tc>
       </w:tr>
@@ -1914,6 +2060,15 @@
                 <w:szCs w:val="18"/>
               </w:rPr>
             </w:pPr>
+            <w:r>
+              <w:rPr>
+                <w:b/>
+                <w:bCs/>
+                <w:sz w:val="18"/>
+                <w:szCs w:val="18"/>
+              </w:rPr>
+              <w:t>Realizar pruebas de certificación tanto de los productos como de los procesos utilizando buenas prácticas definidas por la industria.</w:t>
+            </w:r>
           </w:p>
         </w:tc>
         <w:tc>
@@ -1962,6 +2117,15 @@
                 <w:szCs w:val="18"/>
               </w:rPr>
             </w:pPr>
+            <w:r>
+              <w:rPr>
+                <w:b/>
+                <w:bCs/>
+                <w:sz w:val="18"/>
+                <w:szCs w:val="18"/>
+              </w:rPr>
+              <w:t>X</w:t>
+            </w:r>
           </w:p>
         </w:tc>
         <w:tc>
@@ -2010,6 +2174,15 @@
                 <w:szCs w:val="18"/>
               </w:rPr>
             </w:pPr>
+            <w:r>
+              <w:rPr>
+                <w:b/>
+                <w:bCs/>
+                <w:sz w:val="18"/>
+                <w:szCs w:val="18"/>
+              </w:rPr>
+              <w:t>Porque siento que ya pasó demasiado tiempo desde la última vez que realicé pruebas de certificación de los sistemas que he construido.</w:t>
+            </w:r>
           </w:p>
         </w:tc>
       </w:tr>
@@ -2032,6 +2205,15 @@
                 <w:szCs w:val="18"/>
               </w:rPr>
             </w:pPr>
+            <w:r>
+              <w:rPr>
+                <w:b/>
+                <w:bCs/>
+                <w:sz w:val="18"/>
+                <w:szCs w:val="18"/>
+              </w:rPr>
+              <w:t>Construir el modelo arquitectónico de una solución sistémica que soporte los procesos de negocio de acuerdo los requerimientos de la organización y estándares industria.</w:t>
+            </w:r>
           </w:p>
         </w:tc>
         <w:tc>
@@ -2048,6 +2230,15 @@
                 <w:szCs w:val="18"/>
               </w:rPr>
             </w:pPr>
+            <w:r>
+              <w:rPr>
+                <w:b/>
+                <w:bCs/>
+                <w:sz w:val="18"/>
+                <w:szCs w:val="18"/>
+              </w:rPr>
+              <w:t>X</w:t>
+            </w:r>
           </w:p>
         </w:tc>
         <w:tc>
@@ -2128,6 +2319,15 @@
                 <w:szCs w:val="18"/>
               </w:rPr>
             </w:pPr>
+            <w:r>
+              <w:rPr>
+                <w:b/>
+                <w:bCs/>
+                <w:sz w:val="18"/>
+                <w:szCs w:val="18"/>
+              </w:rPr>
+              <w:t>Porque he logrado realizar varias arquitecturas para diferentes proyectos y entre el grupo nos hemos corregido constantemente para lograr un excelente resultado.</w:t>
+            </w:r>
           </w:p>
         </w:tc>
       </w:tr>
@@ -2150,6 +2350,15 @@
                 <w:szCs w:val="18"/>
               </w:rPr>
             </w:pPr>
+            <w:r>
+              <w:rPr>
+                <w:b/>
+                <w:bCs/>
+                <w:sz w:val="18"/>
+                <w:szCs w:val="18"/>
+              </w:rPr>
+              <w:t>Implementar soluciones sistémicas integrales para automatizar u optimizar procesos de negocio de acuerdo a las necesidades de la organización.</w:t>
+            </w:r>
           </w:p>
         </w:tc>
         <w:tc>
@@ -2166,6 +2375,15 @@
                 <w:szCs w:val="18"/>
               </w:rPr>
             </w:pPr>
+            <w:r>
+              <w:rPr>
+                <w:b/>
+                <w:bCs/>
+                <w:sz w:val="18"/>
+                <w:szCs w:val="18"/>
+              </w:rPr>
+              <w:t>X</w:t>
+            </w:r>
           </w:p>
         </w:tc>
         <w:tc>
@@ -2246,6 +2464,1776 @@
                 <w:szCs w:val="18"/>
               </w:rPr>
             </w:pPr>
+            <w:r>
+              <w:rPr>
+                <w:b/>
+                <w:bCs/>
+                <w:sz w:val="18"/>
+                <w:szCs w:val="18"/>
+              </w:rPr>
+              <w:t>Como había mencionado anteriormente, creo que soy más que capas de implementar soluciones sistémicas par optimizar procesos de negocio.</w:t>
+            </w:r>
+          </w:p>
+        </w:tc>
+      </w:tr>
+      <w:tr>
+        <w:trPr>
+          <w:trHeight w:val="576"/>
+          <w:jc w:val="center"/>
+        </w:trPr>
+        <w:tc>
+          <w:tcPr>
+            <w:tcW w:w="1931" w:type="dxa"/>
+          </w:tcPr>
+          <w:p>
+            <w:pPr>
+              <w:jc w:val="center"/>
+              <w:rPr>
+                <w:b/>
+                <w:bCs/>
+                <w:sz w:val="18"/>
+                <w:szCs w:val="18"/>
+              </w:rPr>
+            </w:pPr>
+            <w:r>
+              <w:rPr>
+                <w:b/>
+                <w:bCs/>
+                <w:sz w:val="18"/>
+                <w:szCs w:val="18"/>
+              </w:rPr>
+              <w:t>Resolver las vulnerabilidades sistémicas para asegurar que el software construido cumple las normas de seguridad exigidas por la industria.</w:t>
+            </w:r>
+          </w:p>
+        </w:tc>
+        <w:tc>
+          <w:tcPr>
+            <w:tcW w:w="1017" w:type="dxa"/>
+          </w:tcPr>
+          <w:p>
+            <w:pPr>
+              <w:jc w:val="center"/>
+              <w:rPr>
+                <w:b/>
+                <w:bCs/>
+                <w:sz w:val="18"/>
+                <w:szCs w:val="18"/>
+              </w:rPr>
+            </w:pPr>
+          </w:p>
+        </w:tc>
+        <w:tc>
+          <w:tcPr>
+            <w:tcW w:w="926" w:type="dxa"/>
+          </w:tcPr>
+          <w:p>
+            <w:pPr>
+              <w:jc w:val="center"/>
+              <w:rPr>
+                <w:b/>
+                <w:bCs/>
+                <w:sz w:val="18"/>
+                <w:szCs w:val="18"/>
+              </w:rPr>
+            </w:pPr>
+          </w:p>
+        </w:tc>
+        <w:tc>
+          <w:tcPr>
+            <w:tcW w:w="1055" w:type="dxa"/>
+          </w:tcPr>
+          <w:p>
+            <w:pPr>
+              <w:jc w:val="center"/>
+              <w:rPr>
+                <w:b/>
+                <w:bCs/>
+                <w:sz w:val="18"/>
+                <w:szCs w:val="18"/>
+              </w:rPr>
+            </w:pPr>
+            <w:r>
+              <w:rPr>
+                <w:b/>
+                <w:bCs/>
+                <w:sz w:val="18"/>
+                <w:szCs w:val="18"/>
+              </w:rPr>
+              <w:t>X</w:t>
+            </w:r>
+          </w:p>
+        </w:tc>
+        <w:tc>
+          <w:tcPr>
+            <w:tcW w:w="1187" w:type="dxa"/>
+          </w:tcPr>
+          <w:p>
+            <w:pPr>
+              <w:jc w:val="center"/>
+              <w:rPr>
+                <w:b/>
+                <w:bCs/>
+                <w:sz w:val="18"/>
+                <w:szCs w:val="18"/>
+              </w:rPr>
+            </w:pPr>
+          </w:p>
+        </w:tc>
+        <w:tc>
+          <w:tcPr>
+            <w:tcW w:w="1250" w:type="dxa"/>
+          </w:tcPr>
+          <w:p>
+            <w:pPr>
+              <w:jc w:val="center"/>
+              <w:rPr>
+                <w:b/>
+                <w:bCs/>
+                <w:sz w:val="18"/>
+                <w:szCs w:val="18"/>
+              </w:rPr>
+            </w:pPr>
+          </w:p>
+        </w:tc>
+        <w:tc>
+          <w:tcPr>
+            <w:tcW w:w="2557" w:type="dxa"/>
+          </w:tcPr>
+          <w:p>
+            <w:pPr>
+              <w:jc w:val="center"/>
+              <w:rPr>
+                <w:b/>
+                <w:bCs/>
+                <w:sz w:val="18"/>
+                <w:szCs w:val="18"/>
+              </w:rPr>
+            </w:pPr>
+            <w:r>
+              <w:rPr>
+                <w:b/>
+                <w:bCs/>
+                <w:sz w:val="18"/>
+                <w:szCs w:val="18"/>
+              </w:rPr>
+              <w:t>Porque realmente no me interesó mucho la materia y no presté demasiada atención, pero creo saber como funcionan las vulnerabilidades más comunes y como evitarlas.</w:t>
+            </w:r>
+          </w:p>
+        </w:tc>
+      </w:tr>
+      <w:tr>
+        <w:trPr>
+          <w:trHeight w:val="576"/>
+          <w:jc w:val="center"/>
+        </w:trPr>
+        <w:tc>
+          <w:tcPr>
+            <w:tcW w:w="1931" w:type="dxa"/>
+          </w:tcPr>
+          <w:p>
+            <w:pPr>
+              <w:jc w:val="center"/>
+              <w:rPr>
+                <w:b/>
+                <w:bCs/>
+                <w:sz w:val="18"/>
+                <w:szCs w:val="18"/>
+              </w:rPr>
+            </w:pPr>
+            <w:r>
+              <w:rPr>
+                <w:b/>
+                <w:bCs/>
+                <w:sz w:val="18"/>
+                <w:szCs w:val="18"/>
+              </w:rPr>
+              <w:t>Gestionar proyectos informáticos, ofreciendo alternativas para la toma de decisiones de acuerdo a los requerimientos de la organización.</w:t>
+            </w:r>
+          </w:p>
+        </w:tc>
+        <w:tc>
+          <w:tcPr>
+            <w:tcW w:w="1017" w:type="dxa"/>
+          </w:tcPr>
+          <w:p>
+            <w:pPr>
+              <w:jc w:val="center"/>
+              <w:rPr>
+                <w:b/>
+                <w:bCs/>
+                <w:sz w:val="18"/>
+                <w:szCs w:val="18"/>
+              </w:rPr>
+            </w:pPr>
+            <w:r>
+              <w:rPr>
+                <w:b/>
+                <w:bCs/>
+                <w:sz w:val="18"/>
+                <w:szCs w:val="18"/>
+              </w:rPr>
+              <w:t>X</w:t>
+            </w:r>
+          </w:p>
+        </w:tc>
+        <w:tc>
+          <w:tcPr>
+            <w:tcW w:w="926" w:type="dxa"/>
+          </w:tcPr>
+          <w:p>
+            <w:pPr>
+              <w:jc w:val="center"/>
+              <w:rPr>
+                <w:b/>
+                <w:bCs/>
+                <w:sz w:val="18"/>
+                <w:szCs w:val="18"/>
+              </w:rPr>
+            </w:pPr>
+          </w:p>
+        </w:tc>
+        <w:tc>
+          <w:tcPr>
+            <w:tcW w:w="1055" w:type="dxa"/>
+          </w:tcPr>
+          <w:p>
+            <w:pPr>
+              <w:jc w:val="center"/>
+              <w:rPr>
+                <w:b/>
+                <w:bCs/>
+                <w:sz w:val="18"/>
+                <w:szCs w:val="18"/>
+              </w:rPr>
+            </w:pPr>
+          </w:p>
+        </w:tc>
+        <w:tc>
+          <w:tcPr>
+            <w:tcW w:w="1187" w:type="dxa"/>
+          </w:tcPr>
+          <w:p>
+            <w:pPr>
+              <w:jc w:val="center"/>
+              <w:rPr>
+                <w:b/>
+                <w:bCs/>
+                <w:sz w:val="18"/>
+                <w:szCs w:val="18"/>
+              </w:rPr>
+            </w:pPr>
+          </w:p>
+        </w:tc>
+        <w:tc>
+          <w:tcPr>
+            <w:tcW w:w="1250" w:type="dxa"/>
+          </w:tcPr>
+          <w:p>
+            <w:pPr>
+              <w:jc w:val="center"/>
+              <w:rPr>
+                <w:b/>
+                <w:bCs/>
+                <w:sz w:val="18"/>
+                <w:szCs w:val="18"/>
+              </w:rPr>
+            </w:pPr>
+          </w:p>
+        </w:tc>
+        <w:tc>
+          <w:tcPr>
+            <w:tcW w:w="2557" w:type="dxa"/>
+          </w:tcPr>
+          <w:p>
+            <w:pPr>
+              <w:jc w:val="center"/>
+              <w:rPr>
+                <w:b/>
+                <w:bCs/>
+                <w:sz w:val="18"/>
+                <w:szCs w:val="18"/>
+              </w:rPr>
+            </w:pPr>
+            <w:r>
+              <w:rPr>
+                <w:b/>
+                <w:bCs/>
+                <w:sz w:val="18"/>
+                <w:szCs w:val="18"/>
+              </w:rPr>
+              <w:t xml:space="preserve">A lo largo de estos últimos años, creo tener la habilidad para poder </w:t>
+            </w:r>
+            <w:r>
+              <w:rPr>
+                <w:b/>
+                <w:bCs/>
+                <w:sz w:val="18"/>
+                <w:szCs w:val="18"/>
+              </w:rPr>
+              <w:t>revisar el contexto de la organización y poder ayudar a tomar decisiones importantes en su contexto.</w:t>
+            </w:r>
+          </w:p>
+        </w:tc>
+      </w:tr>
+      <w:tr>
+        <w:trPr>
+          <w:trHeight w:val="576"/>
+          <w:jc w:val="center"/>
+        </w:trPr>
+        <w:tc>
+          <w:tcPr>
+            <w:tcW w:w="1931" w:type="dxa"/>
+          </w:tcPr>
+          <w:p>
+            <w:pPr>
+              <w:jc w:val="center"/>
+              <w:rPr>
+                <w:b/>
+                <w:bCs/>
+                <w:sz w:val="18"/>
+                <w:szCs w:val="18"/>
+              </w:rPr>
+            </w:pPr>
+            <w:r>
+              <w:rPr>
+                <w:b/>
+                <w:bCs/>
+                <w:sz w:val="18"/>
+                <w:szCs w:val="18"/>
+              </w:rPr>
+              <w:t>Desarrollar la transformación de grandes volúmenes de datos para la obtención de información y conocimiento de la organización a fin de apoyar la toma de decisiones y la mejora de los procesos de negocio, de acuerdo a las necesidades de la organización.</w:t>
+            </w:r>
+          </w:p>
+        </w:tc>
+        <w:tc>
+          <w:tcPr>
+            <w:tcW w:w="1017" w:type="dxa"/>
+          </w:tcPr>
+          <w:p>
+            <w:pPr>
+              <w:jc w:val="center"/>
+              <w:rPr>
+                <w:b/>
+                <w:bCs/>
+                <w:sz w:val="18"/>
+                <w:szCs w:val="18"/>
+              </w:rPr>
+            </w:pPr>
+            <w:r>
+              <w:rPr>
+                <w:b/>
+                <w:bCs/>
+                <w:sz w:val="18"/>
+                <w:szCs w:val="18"/>
+              </w:rPr>
+              <w:t>X</w:t>
+            </w:r>
+          </w:p>
+        </w:tc>
+        <w:tc>
+          <w:tcPr>
+            <w:tcW w:w="926" w:type="dxa"/>
+          </w:tcPr>
+          <w:p>
+            <w:pPr>
+              <w:jc w:val="center"/>
+              <w:rPr>
+                <w:b/>
+                <w:bCs/>
+                <w:sz w:val="18"/>
+                <w:szCs w:val="18"/>
+              </w:rPr>
+            </w:pPr>
+          </w:p>
+        </w:tc>
+        <w:tc>
+          <w:tcPr>
+            <w:tcW w:w="1055" w:type="dxa"/>
+          </w:tcPr>
+          <w:p>
+            <w:pPr>
+              <w:jc w:val="center"/>
+              <w:rPr>
+                <w:b/>
+                <w:bCs/>
+                <w:sz w:val="18"/>
+                <w:szCs w:val="18"/>
+              </w:rPr>
+            </w:pPr>
+          </w:p>
+        </w:tc>
+        <w:tc>
+          <w:tcPr>
+            <w:tcW w:w="1187" w:type="dxa"/>
+          </w:tcPr>
+          <w:p>
+            <w:pPr>
+              <w:jc w:val="center"/>
+              <w:rPr>
+                <w:b/>
+                <w:bCs/>
+                <w:sz w:val="18"/>
+                <w:szCs w:val="18"/>
+              </w:rPr>
+            </w:pPr>
+          </w:p>
+        </w:tc>
+        <w:tc>
+          <w:tcPr>
+            <w:tcW w:w="1250" w:type="dxa"/>
+          </w:tcPr>
+          <w:p>
+            <w:pPr>
+              <w:jc w:val="center"/>
+              <w:rPr>
+                <w:b/>
+                <w:bCs/>
+                <w:sz w:val="18"/>
+                <w:szCs w:val="18"/>
+              </w:rPr>
+            </w:pPr>
+          </w:p>
+        </w:tc>
+        <w:tc>
+          <w:tcPr>
+            <w:tcW w:w="2557" w:type="dxa"/>
+          </w:tcPr>
+          <w:p>
+            <w:pPr>
+              <w:jc w:val="center"/>
+              <w:rPr>
+                <w:b/>
+                <w:bCs/>
+                <w:sz w:val="18"/>
+                <w:szCs w:val="18"/>
+              </w:rPr>
+            </w:pPr>
+            <w:r>
+              <w:rPr>
+                <w:b/>
+                <w:bCs/>
+                <w:sz w:val="18"/>
+                <w:szCs w:val="18"/>
+              </w:rPr>
+              <w:t>Siento que tengo la habilidad excelente para el manejo de sistemas de SSIS para realizar dashboards para visualizar los datos y poder tomar decisiones pertinentes al contexto de la empresa y del la industria.</w:t>
+            </w:r>
+          </w:p>
+        </w:tc>
+      </w:tr>
+      <w:tr>
+        <w:trPr>
+          <w:trHeight w:val="576"/>
+          <w:jc w:val="center"/>
+        </w:trPr>
+        <w:tc>
+          <w:tcPr>
+            <w:tcW w:w="1931" w:type="dxa"/>
+          </w:tcPr>
+          <w:p>
+            <w:pPr>
+              <w:jc w:val="center"/>
+              <w:rPr>
+                <w:b/>
+                <w:bCs/>
+                <w:sz w:val="18"/>
+                <w:szCs w:val="18"/>
+              </w:rPr>
+            </w:pPr>
+            <w:r>
+              <w:rPr>
+                <w:b/>
+                <w:bCs/>
+                <w:sz w:val="18"/>
+                <w:szCs w:val="18"/>
+              </w:rPr>
+              <w:lastRenderedPageBreak/>
+              <w:t>Resolver situaciones problemáticas de la vida cotidiana, educación superior y mundo laboral, utilizando operaciones básicas con números, expresiones algebraicas, razonamiento matemático básico y formas y espacio, de acuerdo a requerimientos.</w:t>
+            </w:r>
+          </w:p>
+        </w:tc>
+        <w:tc>
+          <w:tcPr>
+            <w:tcW w:w="1017" w:type="dxa"/>
+          </w:tcPr>
+          <w:p>
+            <w:pPr>
+              <w:jc w:val="center"/>
+              <w:rPr>
+                <w:b/>
+                <w:bCs/>
+                <w:sz w:val="18"/>
+                <w:szCs w:val="18"/>
+              </w:rPr>
+            </w:pPr>
+            <w:r>
+              <w:rPr>
+                <w:b/>
+                <w:bCs/>
+                <w:sz w:val="18"/>
+                <w:szCs w:val="18"/>
+              </w:rPr>
+              <w:t>X</w:t>
+            </w:r>
+          </w:p>
+        </w:tc>
+        <w:tc>
+          <w:tcPr>
+            <w:tcW w:w="926" w:type="dxa"/>
+          </w:tcPr>
+          <w:p>
+            <w:pPr>
+              <w:jc w:val="center"/>
+              <w:rPr>
+                <w:b/>
+                <w:bCs/>
+                <w:sz w:val="18"/>
+                <w:szCs w:val="18"/>
+              </w:rPr>
+            </w:pPr>
+          </w:p>
+        </w:tc>
+        <w:tc>
+          <w:tcPr>
+            <w:tcW w:w="1055" w:type="dxa"/>
+          </w:tcPr>
+          <w:p>
+            <w:pPr>
+              <w:jc w:val="center"/>
+              <w:rPr>
+                <w:b/>
+                <w:bCs/>
+                <w:sz w:val="18"/>
+                <w:szCs w:val="18"/>
+              </w:rPr>
+            </w:pPr>
+          </w:p>
+        </w:tc>
+        <w:tc>
+          <w:tcPr>
+            <w:tcW w:w="1187" w:type="dxa"/>
+          </w:tcPr>
+          <w:p>
+            <w:pPr>
+              <w:jc w:val="center"/>
+              <w:rPr>
+                <w:b/>
+                <w:bCs/>
+                <w:sz w:val="18"/>
+                <w:szCs w:val="18"/>
+              </w:rPr>
+            </w:pPr>
+          </w:p>
+        </w:tc>
+        <w:tc>
+          <w:tcPr>
+            <w:tcW w:w="1250" w:type="dxa"/>
+          </w:tcPr>
+          <w:p>
+            <w:pPr>
+              <w:jc w:val="center"/>
+              <w:rPr>
+                <w:b/>
+                <w:bCs/>
+                <w:sz w:val="18"/>
+                <w:szCs w:val="18"/>
+              </w:rPr>
+            </w:pPr>
+          </w:p>
+        </w:tc>
+        <w:tc>
+          <w:tcPr>
+            <w:tcW w:w="2557" w:type="dxa"/>
+          </w:tcPr>
+          <w:p>
+            <w:pPr>
+              <w:jc w:val="center"/>
+              <w:rPr>
+                <w:b/>
+                <w:bCs/>
+                <w:sz w:val="18"/>
+                <w:szCs w:val="18"/>
+              </w:rPr>
+            </w:pPr>
+            <w:r>
+              <w:rPr>
+                <w:b/>
+                <w:bCs/>
+                <w:sz w:val="18"/>
+                <w:szCs w:val="18"/>
+              </w:rPr>
+              <w:t>Creo que soy bastante capaz de realizar tanto algoritmos que resuelvan o automaticen problemas o procesos como problemas de la vida utilizando operaciones matemáticas básicas.</w:t>
+            </w:r>
+          </w:p>
+        </w:tc>
+      </w:tr>
+      <w:tr>
+        <w:trPr>
+          <w:trHeight w:val="576"/>
+          <w:jc w:val="center"/>
+        </w:trPr>
+        <w:tc>
+          <w:tcPr>
+            <w:tcW w:w="1931" w:type="dxa"/>
+          </w:tcPr>
+          <w:p>
+            <w:pPr>
+              <w:jc w:val="center"/>
+              <w:rPr>
+                <w:b/>
+                <w:bCs/>
+                <w:sz w:val="18"/>
+                <w:szCs w:val="18"/>
+              </w:rPr>
+            </w:pPr>
+            <w:r>
+              <w:rPr>
+                <w:b/>
+                <w:bCs/>
+                <w:sz w:val="18"/>
+                <w:szCs w:val="18"/>
+              </w:rPr>
+              <w:t>Resolver situaciones problemáticas de la vida cotidiana, educación superior y mundo laboral, utilizando elementos de las matemáticas discretas y relaciones funcionales, de acuerdo a requerimientos.</w:t>
+            </w:r>
+          </w:p>
+        </w:tc>
+        <w:tc>
+          <w:tcPr>
+            <w:tcW w:w="1017" w:type="dxa"/>
+          </w:tcPr>
+          <w:p>
+            <w:pPr>
+              <w:jc w:val="center"/>
+              <w:rPr>
+                <w:b/>
+                <w:bCs/>
+                <w:sz w:val="18"/>
+                <w:szCs w:val="18"/>
+              </w:rPr>
+            </w:pPr>
+          </w:p>
+        </w:tc>
+        <w:tc>
+          <w:tcPr>
+            <w:tcW w:w="926" w:type="dxa"/>
+          </w:tcPr>
+          <w:p>
+            <w:pPr>
+              <w:jc w:val="center"/>
+              <w:rPr>
+                <w:b/>
+                <w:bCs/>
+                <w:sz w:val="18"/>
+                <w:szCs w:val="18"/>
+              </w:rPr>
+            </w:pPr>
+            <w:r>
+              <w:rPr>
+                <w:b/>
+                <w:bCs/>
+                <w:sz w:val="18"/>
+                <w:szCs w:val="18"/>
+              </w:rPr>
+              <w:t>X</w:t>
+            </w:r>
+          </w:p>
+        </w:tc>
+        <w:tc>
+          <w:tcPr>
+            <w:tcW w:w="1055" w:type="dxa"/>
+          </w:tcPr>
+          <w:p>
+            <w:pPr>
+              <w:jc w:val="center"/>
+              <w:rPr>
+                <w:b/>
+                <w:bCs/>
+                <w:sz w:val="18"/>
+                <w:szCs w:val="18"/>
+              </w:rPr>
+            </w:pPr>
+          </w:p>
+        </w:tc>
+        <w:tc>
+          <w:tcPr>
+            <w:tcW w:w="1187" w:type="dxa"/>
+          </w:tcPr>
+          <w:p>
+            <w:pPr>
+              <w:jc w:val="center"/>
+              <w:rPr>
+                <w:b/>
+                <w:bCs/>
+                <w:sz w:val="18"/>
+                <w:szCs w:val="18"/>
+              </w:rPr>
+            </w:pPr>
+          </w:p>
+        </w:tc>
+        <w:tc>
+          <w:tcPr>
+            <w:tcW w:w="1250" w:type="dxa"/>
+          </w:tcPr>
+          <w:p>
+            <w:pPr>
+              <w:jc w:val="center"/>
+              <w:rPr>
+                <w:b/>
+                <w:bCs/>
+                <w:sz w:val="18"/>
+                <w:szCs w:val="18"/>
+              </w:rPr>
+            </w:pPr>
+          </w:p>
+        </w:tc>
+        <w:tc>
+          <w:tcPr>
+            <w:tcW w:w="2557" w:type="dxa"/>
+          </w:tcPr>
+          <w:p>
+            <w:pPr>
+              <w:jc w:val="center"/>
+              <w:rPr>
+                <w:b/>
+                <w:bCs/>
+                <w:sz w:val="18"/>
+                <w:szCs w:val="18"/>
+              </w:rPr>
+            </w:pPr>
+            <w:r>
+              <w:rPr>
+                <w:b/>
+                <w:bCs/>
+                <w:sz w:val="18"/>
+                <w:szCs w:val="18"/>
+              </w:rPr>
+              <w:t>Lo mismo que lo anterior.</w:t>
+            </w:r>
+          </w:p>
+        </w:tc>
+      </w:tr>
+      <w:tr>
+        <w:trPr>
+          <w:trHeight w:val="576"/>
+          <w:jc w:val="center"/>
+        </w:trPr>
+        <w:tc>
+          <w:tcPr>
+            <w:tcW w:w="1931" w:type="dxa"/>
+          </w:tcPr>
+          <w:p>
+            <w:pPr>
+              <w:jc w:val="center"/>
+              <w:rPr>
+                <w:b/>
+                <w:bCs/>
+                <w:sz w:val="18"/>
+                <w:szCs w:val="18"/>
+              </w:rPr>
+            </w:pPr>
+            <w:r>
+              <w:rPr>
+                <w:b/>
+                <w:bCs/>
+                <w:sz w:val="18"/>
+                <w:szCs w:val="18"/>
+              </w:rPr>
+              <w:t>Resolver situaciones problemáticas de la educación superior y mundo laboral, utilizando elementos de la estadística descriptiva, de acuerdo a requerimientos.</w:t>
+            </w:r>
+          </w:p>
+        </w:tc>
+        <w:tc>
+          <w:tcPr>
+            <w:tcW w:w="1017" w:type="dxa"/>
+          </w:tcPr>
+          <w:p>
+            <w:pPr>
+              <w:jc w:val="center"/>
+              <w:rPr>
+                <w:b/>
+                <w:bCs/>
+                <w:sz w:val="18"/>
+                <w:szCs w:val="18"/>
+              </w:rPr>
+            </w:pPr>
+          </w:p>
+        </w:tc>
+        <w:tc>
+          <w:tcPr>
+            <w:tcW w:w="926" w:type="dxa"/>
+          </w:tcPr>
+          <w:p>
+            <w:pPr>
+              <w:jc w:val="center"/>
+              <w:rPr>
+                <w:b/>
+                <w:bCs/>
+                <w:sz w:val="18"/>
+                <w:szCs w:val="18"/>
+              </w:rPr>
+            </w:pPr>
+            <w:r>
+              <w:rPr>
+                <w:b/>
+                <w:bCs/>
+                <w:sz w:val="18"/>
+                <w:szCs w:val="18"/>
+              </w:rPr>
+              <w:t>X</w:t>
+            </w:r>
+          </w:p>
+        </w:tc>
+        <w:tc>
+          <w:tcPr>
+            <w:tcW w:w="1055" w:type="dxa"/>
+          </w:tcPr>
+          <w:p>
+            <w:pPr>
+              <w:jc w:val="center"/>
+              <w:rPr>
+                <w:b/>
+                <w:bCs/>
+                <w:sz w:val="18"/>
+                <w:szCs w:val="18"/>
+              </w:rPr>
+            </w:pPr>
+          </w:p>
+        </w:tc>
+        <w:tc>
+          <w:tcPr>
+            <w:tcW w:w="1187" w:type="dxa"/>
+          </w:tcPr>
+          <w:p>
+            <w:pPr>
+              <w:jc w:val="center"/>
+              <w:rPr>
+                <w:b/>
+                <w:bCs/>
+                <w:sz w:val="18"/>
+                <w:szCs w:val="18"/>
+              </w:rPr>
+            </w:pPr>
+          </w:p>
+        </w:tc>
+        <w:tc>
+          <w:tcPr>
+            <w:tcW w:w="1250" w:type="dxa"/>
+          </w:tcPr>
+          <w:p>
+            <w:pPr>
+              <w:jc w:val="center"/>
+              <w:rPr>
+                <w:b/>
+                <w:bCs/>
+                <w:sz w:val="18"/>
+                <w:szCs w:val="18"/>
+              </w:rPr>
+            </w:pPr>
+          </w:p>
+        </w:tc>
+        <w:tc>
+          <w:tcPr>
+            <w:tcW w:w="2557" w:type="dxa"/>
+          </w:tcPr>
+          <w:p>
+            <w:pPr>
+              <w:jc w:val="center"/>
+              <w:rPr>
+                <w:b/>
+                <w:bCs/>
+                <w:sz w:val="18"/>
+                <w:szCs w:val="18"/>
+              </w:rPr>
+            </w:pPr>
+            <w:r>
+              <w:rPr>
+                <w:b/>
+                <w:bCs/>
+                <w:sz w:val="18"/>
+                <w:szCs w:val="18"/>
+              </w:rPr>
+              <w:t>No suelo hacerlo, pero considero que soy capaz de resolver problemas haciendo uso de la estadística descriptiva.</w:t>
+            </w:r>
+          </w:p>
+        </w:tc>
+      </w:tr>
+      <w:tr>
+        <w:trPr>
+          <w:trHeight w:val="576"/>
+          <w:jc w:val="center"/>
+        </w:trPr>
+        <w:tc>
+          <w:tcPr>
+            <w:tcW w:w="1931" w:type="dxa"/>
+          </w:tcPr>
+          <w:p>
+            <w:pPr>
+              <w:jc w:val="center"/>
+              <w:rPr>
+                <w:b/>
+                <w:bCs/>
+                <w:sz w:val="18"/>
+                <w:szCs w:val="18"/>
+              </w:rPr>
+            </w:pPr>
+            <w:r>
+              <w:rPr>
+                <w:b/>
+                <w:bCs/>
+                <w:sz w:val="18"/>
+                <w:szCs w:val="18"/>
+              </w:rPr>
+              <w:t>Comunicar en forma oral o escrita, aplicando herramientas lingüístico-pragmáticas y estrategias de comprensión que permiten la solución de problemas comunicativos en los contextos académicos, de acuerdo al marco común de referencia de las lenguas.</w:t>
+            </w:r>
+          </w:p>
+        </w:tc>
+        <w:tc>
+          <w:tcPr>
+            <w:tcW w:w="1017" w:type="dxa"/>
+          </w:tcPr>
+          <w:p>
+            <w:pPr>
+              <w:jc w:val="center"/>
+              <w:rPr>
+                <w:b/>
+                <w:bCs/>
+                <w:sz w:val="18"/>
+                <w:szCs w:val="18"/>
+              </w:rPr>
+            </w:pPr>
+            <w:r>
+              <w:rPr>
+                <w:b/>
+                <w:bCs/>
+                <w:sz w:val="18"/>
+                <w:szCs w:val="18"/>
+              </w:rPr>
+              <w:t>X</w:t>
+            </w:r>
+          </w:p>
+        </w:tc>
+        <w:tc>
+          <w:tcPr>
+            <w:tcW w:w="926" w:type="dxa"/>
+          </w:tcPr>
+          <w:p>
+            <w:pPr>
+              <w:jc w:val="center"/>
+              <w:rPr>
+                <w:b/>
+                <w:bCs/>
+                <w:sz w:val="18"/>
+                <w:szCs w:val="18"/>
+              </w:rPr>
+            </w:pPr>
+          </w:p>
+        </w:tc>
+        <w:tc>
+          <w:tcPr>
+            <w:tcW w:w="1055" w:type="dxa"/>
+          </w:tcPr>
+          <w:p>
+            <w:pPr>
+              <w:jc w:val="center"/>
+              <w:rPr>
+                <w:b/>
+                <w:bCs/>
+                <w:sz w:val="18"/>
+                <w:szCs w:val="18"/>
+              </w:rPr>
+            </w:pPr>
+          </w:p>
+        </w:tc>
+        <w:tc>
+          <w:tcPr>
+            <w:tcW w:w="1187" w:type="dxa"/>
+          </w:tcPr>
+          <w:p>
+            <w:pPr>
+              <w:jc w:val="center"/>
+              <w:rPr>
+                <w:b/>
+                <w:bCs/>
+                <w:sz w:val="18"/>
+                <w:szCs w:val="18"/>
+              </w:rPr>
+            </w:pPr>
+          </w:p>
+        </w:tc>
+        <w:tc>
+          <w:tcPr>
+            <w:tcW w:w="1250" w:type="dxa"/>
+          </w:tcPr>
+          <w:p>
+            <w:pPr>
+              <w:jc w:val="center"/>
+              <w:rPr>
+                <w:b/>
+                <w:bCs/>
+                <w:sz w:val="18"/>
+                <w:szCs w:val="18"/>
+              </w:rPr>
+            </w:pPr>
+          </w:p>
+        </w:tc>
+        <w:tc>
+          <w:tcPr>
+            <w:tcW w:w="2557" w:type="dxa"/>
+          </w:tcPr>
+          <w:p>
+            <w:pPr>
+              <w:jc w:val="center"/>
+              <w:rPr>
+                <w:b/>
+                <w:bCs/>
+                <w:sz w:val="18"/>
+                <w:szCs w:val="18"/>
+              </w:rPr>
+            </w:pPr>
+            <w:r>
+              <w:rPr>
+                <w:b/>
+                <w:bCs/>
+                <w:sz w:val="18"/>
+                <w:szCs w:val="18"/>
+              </w:rPr>
+              <w:t>Considero que puedo comunicar de manera escrita y orla lo que requiera expresar de modo que sea entendible.</w:t>
+            </w:r>
+          </w:p>
+        </w:tc>
+      </w:tr>
+      <w:tr>
+        <w:trPr>
+          <w:trHeight w:val="576"/>
+          <w:jc w:val="center"/>
+        </w:trPr>
+        <w:tc>
+          <w:tcPr>
+            <w:tcW w:w="1931" w:type="dxa"/>
+          </w:tcPr>
+          <w:p>
+            <w:pPr>
+              <w:jc w:val="center"/>
+              <w:rPr>
+                <w:b/>
+                <w:bCs/>
+                <w:sz w:val="18"/>
+                <w:szCs w:val="18"/>
+              </w:rPr>
+            </w:pPr>
+            <w:r>
+              <w:rPr>
+                <w:b/>
+                <w:bCs/>
+                <w:sz w:val="18"/>
+                <w:szCs w:val="18"/>
+              </w:rPr>
+              <w:t xml:space="preserve">Comunicarse de forma oral y escrita usando el idioma inglés en situaciones socio-laborales a un nivel intermedio, según la Tabla de </w:t>
+            </w:r>
+            <w:r>
+              <w:rPr>
+                <w:b/>
+                <w:bCs/>
+                <w:sz w:val="18"/>
+                <w:szCs w:val="18"/>
+              </w:rPr>
+              <w:lastRenderedPageBreak/>
+              <w:t>Competencias TOEIC y CEFR.</w:t>
+            </w:r>
+          </w:p>
+        </w:tc>
+        <w:tc>
+          <w:tcPr>
+            <w:tcW w:w="1017" w:type="dxa"/>
+          </w:tcPr>
+          <w:p>
+            <w:pPr>
+              <w:jc w:val="center"/>
+              <w:rPr>
+                <w:b/>
+                <w:bCs/>
+                <w:sz w:val="18"/>
+                <w:szCs w:val="18"/>
+              </w:rPr>
+            </w:pPr>
+            <w:r>
+              <w:rPr>
+                <w:b/>
+                <w:bCs/>
+                <w:sz w:val="18"/>
+                <w:szCs w:val="18"/>
+              </w:rPr>
+              <w:lastRenderedPageBreak/>
+              <w:t>X</w:t>
+            </w:r>
+          </w:p>
+        </w:tc>
+        <w:tc>
+          <w:tcPr>
+            <w:tcW w:w="926" w:type="dxa"/>
+          </w:tcPr>
+          <w:p>
+            <w:pPr>
+              <w:jc w:val="center"/>
+              <w:rPr>
+                <w:b/>
+                <w:bCs/>
+                <w:sz w:val="18"/>
+                <w:szCs w:val="18"/>
+              </w:rPr>
+            </w:pPr>
+          </w:p>
+        </w:tc>
+        <w:tc>
+          <w:tcPr>
+            <w:tcW w:w="1055" w:type="dxa"/>
+          </w:tcPr>
+          <w:p>
+            <w:pPr>
+              <w:jc w:val="center"/>
+              <w:rPr>
+                <w:b/>
+                <w:bCs/>
+                <w:sz w:val="18"/>
+                <w:szCs w:val="18"/>
+              </w:rPr>
+            </w:pPr>
+          </w:p>
+        </w:tc>
+        <w:tc>
+          <w:tcPr>
+            <w:tcW w:w="1187" w:type="dxa"/>
+          </w:tcPr>
+          <w:p>
+            <w:pPr>
+              <w:jc w:val="center"/>
+              <w:rPr>
+                <w:b/>
+                <w:bCs/>
+                <w:sz w:val="18"/>
+                <w:szCs w:val="18"/>
+              </w:rPr>
+            </w:pPr>
+          </w:p>
+        </w:tc>
+        <w:tc>
+          <w:tcPr>
+            <w:tcW w:w="1250" w:type="dxa"/>
+          </w:tcPr>
+          <w:p>
+            <w:pPr>
+              <w:jc w:val="center"/>
+              <w:rPr>
+                <w:b/>
+                <w:bCs/>
+                <w:sz w:val="18"/>
+                <w:szCs w:val="18"/>
+              </w:rPr>
+            </w:pPr>
+          </w:p>
+        </w:tc>
+        <w:tc>
+          <w:tcPr>
+            <w:tcW w:w="2557" w:type="dxa"/>
+          </w:tcPr>
+          <w:p>
+            <w:pPr>
+              <w:jc w:val="center"/>
+              <w:rPr>
+                <w:b/>
+                <w:bCs/>
+                <w:sz w:val="18"/>
+                <w:szCs w:val="18"/>
+              </w:rPr>
+            </w:pPr>
+            <w:r>
+              <w:rPr>
+                <w:b/>
+                <w:bCs/>
+                <w:sz w:val="18"/>
+                <w:szCs w:val="18"/>
+              </w:rPr>
+              <w:t>Considero que soy totalmente capaz de llevar una conversación en ingles ya sea técnica o cotidiana y obtuve una certificación TOEIC de nivel B2</w:t>
+            </w:r>
+          </w:p>
+        </w:tc>
+      </w:tr>
+      <w:tr>
+        <w:trPr>
+          <w:trHeight w:val="576"/>
+          <w:jc w:val="center"/>
+        </w:trPr>
+        <w:tc>
+          <w:tcPr>
+            <w:tcW w:w="1931" w:type="dxa"/>
+          </w:tcPr>
+          <w:p>
+            <w:pPr>
+              <w:jc w:val="center"/>
+              <w:rPr>
+                <w:b/>
+                <w:bCs/>
+                <w:sz w:val="18"/>
+                <w:szCs w:val="18"/>
+              </w:rPr>
+            </w:pPr>
+            <w:r>
+              <w:rPr>
+                <w:b/>
+                <w:bCs/>
+                <w:sz w:val="18"/>
+                <w:szCs w:val="18"/>
+              </w:rPr>
+              <w:t>Comunicarse usando el idioma inglés en situaciones laborales a un nivel intermedio relacionado con su área de especialización, según la Tabla de Competencias TOEIC y CEFR.</w:t>
+            </w:r>
+          </w:p>
+        </w:tc>
+        <w:tc>
+          <w:tcPr>
+            <w:tcW w:w="1017" w:type="dxa"/>
+          </w:tcPr>
+          <w:p>
+            <w:pPr>
+              <w:jc w:val="center"/>
+              <w:rPr>
+                <w:b/>
+                <w:bCs/>
+                <w:sz w:val="18"/>
+                <w:szCs w:val="18"/>
+              </w:rPr>
+            </w:pPr>
+            <w:r>
+              <w:rPr>
+                <w:b/>
+                <w:bCs/>
+                <w:sz w:val="18"/>
+                <w:szCs w:val="18"/>
+              </w:rPr>
+              <w:t>X</w:t>
+            </w:r>
+          </w:p>
+        </w:tc>
+        <w:tc>
+          <w:tcPr>
+            <w:tcW w:w="926" w:type="dxa"/>
+          </w:tcPr>
+          <w:p>
+            <w:pPr>
+              <w:jc w:val="center"/>
+              <w:rPr>
+                <w:b/>
+                <w:bCs/>
+                <w:sz w:val="18"/>
+                <w:szCs w:val="18"/>
+              </w:rPr>
+            </w:pPr>
+          </w:p>
+        </w:tc>
+        <w:tc>
+          <w:tcPr>
+            <w:tcW w:w="1055" w:type="dxa"/>
+          </w:tcPr>
+          <w:p>
+            <w:pPr>
+              <w:jc w:val="center"/>
+              <w:rPr>
+                <w:b/>
+                <w:bCs/>
+                <w:sz w:val="18"/>
+                <w:szCs w:val="18"/>
+              </w:rPr>
+            </w:pPr>
+          </w:p>
+        </w:tc>
+        <w:tc>
+          <w:tcPr>
+            <w:tcW w:w="1187" w:type="dxa"/>
+          </w:tcPr>
+          <w:p>
+            <w:pPr>
+              <w:jc w:val="center"/>
+              <w:rPr>
+                <w:b/>
+                <w:bCs/>
+                <w:sz w:val="18"/>
+                <w:szCs w:val="18"/>
+              </w:rPr>
+            </w:pPr>
+          </w:p>
+        </w:tc>
+        <w:tc>
+          <w:tcPr>
+            <w:tcW w:w="1250" w:type="dxa"/>
+          </w:tcPr>
+          <w:p>
+            <w:pPr>
+              <w:jc w:val="center"/>
+              <w:rPr>
+                <w:b/>
+                <w:bCs/>
+                <w:sz w:val="18"/>
+                <w:szCs w:val="18"/>
+              </w:rPr>
+            </w:pPr>
+          </w:p>
+        </w:tc>
+        <w:tc>
+          <w:tcPr>
+            <w:tcW w:w="2557" w:type="dxa"/>
+          </w:tcPr>
+          <w:p>
+            <w:pPr>
+              <w:jc w:val="center"/>
+              <w:rPr>
+                <w:b/>
+                <w:bCs/>
+                <w:sz w:val="18"/>
+                <w:szCs w:val="18"/>
+              </w:rPr>
+            </w:pPr>
+            <w:r>
+              <w:rPr>
+                <w:b/>
+                <w:bCs/>
+                <w:sz w:val="18"/>
+                <w:szCs w:val="18"/>
+              </w:rPr>
+              <w:t>Lo mismo que la anterior.</w:t>
+            </w:r>
+          </w:p>
+        </w:tc>
+      </w:tr>
+      <w:tr>
+        <w:trPr>
+          <w:trHeight w:val="576"/>
+          <w:jc w:val="center"/>
+        </w:trPr>
+        <w:tc>
+          <w:tcPr>
+            <w:tcW w:w="1931" w:type="dxa"/>
+          </w:tcPr>
+          <w:p>
+            <w:pPr>
+              <w:jc w:val="center"/>
+              <w:rPr>
+                <w:b/>
+                <w:bCs/>
+                <w:sz w:val="18"/>
+                <w:szCs w:val="18"/>
+              </w:rPr>
+            </w:pPr>
+            <w:r>
+              <w:rPr>
+                <w:b/>
+                <w:bCs/>
+                <w:sz w:val="18"/>
+                <w:szCs w:val="18"/>
+              </w:rPr>
+              <w:t>Desarrollar la propia habilidad emprendedora, a través de experiencias en el ámbito de la especialidad.</w:t>
+            </w:r>
+          </w:p>
+        </w:tc>
+        <w:tc>
+          <w:tcPr>
+            <w:tcW w:w="1017" w:type="dxa"/>
+          </w:tcPr>
+          <w:p>
+            <w:pPr>
+              <w:jc w:val="center"/>
+              <w:rPr>
+                <w:b/>
+                <w:bCs/>
+                <w:sz w:val="18"/>
+                <w:szCs w:val="18"/>
+              </w:rPr>
+            </w:pPr>
+          </w:p>
+        </w:tc>
+        <w:tc>
+          <w:tcPr>
+            <w:tcW w:w="926" w:type="dxa"/>
+          </w:tcPr>
+          <w:p>
+            <w:pPr>
+              <w:jc w:val="center"/>
+              <w:rPr>
+                <w:b/>
+                <w:bCs/>
+                <w:sz w:val="18"/>
+                <w:szCs w:val="18"/>
+              </w:rPr>
+            </w:pPr>
+          </w:p>
+        </w:tc>
+        <w:tc>
+          <w:tcPr>
+            <w:tcW w:w="1055" w:type="dxa"/>
+          </w:tcPr>
+          <w:p>
+            <w:pPr>
+              <w:jc w:val="center"/>
+              <w:rPr>
+                <w:b/>
+                <w:bCs/>
+                <w:sz w:val="18"/>
+                <w:szCs w:val="18"/>
+              </w:rPr>
+            </w:pPr>
+            <w:r>
+              <w:rPr>
+                <w:b/>
+                <w:bCs/>
+                <w:sz w:val="18"/>
+                <w:szCs w:val="18"/>
+              </w:rPr>
+              <w:t>X</w:t>
+            </w:r>
+          </w:p>
+        </w:tc>
+        <w:tc>
+          <w:tcPr>
+            <w:tcW w:w="1187" w:type="dxa"/>
+          </w:tcPr>
+          <w:p>
+            <w:pPr>
+              <w:jc w:val="center"/>
+              <w:rPr>
+                <w:b/>
+                <w:bCs/>
+                <w:sz w:val="18"/>
+                <w:szCs w:val="18"/>
+              </w:rPr>
+            </w:pPr>
+          </w:p>
+        </w:tc>
+        <w:tc>
+          <w:tcPr>
+            <w:tcW w:w="1250" w:type="dxa"/>
+          </w:tcPr>
+          <w:p>
+            <w:pPr>
+              <w:jc w:val="center"/>
+              <w:rPr>
+                <w:b/>
+                <w:bCs/>
+                <w:sz w:val="18"/>
+                <w:szCs w:val="18"/>
+              </w:rPr>
+            </w:pPr>
+          </w:p>
+        </w:tc>
+        <w:tc>
+          <w:tcPr>
+            <w:tcW w:w="2557" w:type="dxa"/>
+          </w:tcPr>
+          <w:p>
+            <w:pPr>
+              <w:jc w:val="center"/>
+              <w:rPr>
+                <w:b/>
+                <w:bCs/>
+                <w:sz w:val="18"/>
+                <w:szCs w:val="18"/>
+              </w:rPr>
+            </w:pPr>
+            <w:r>
+              <w:rPr>
+                <w:b/>
+                <w:bCs/>
+                <w:sz w:val="18"/>
+                <w:szCs w:val="18"/>
+              </w:rPr>
+              <w:t>Considero que sé como realizar un emprendimiento desde cero, pero no estoy muy interesado en ello, por ende no recuerdo varios detalles importantes.</w:t>
+            </w:r>
+          </w:p>
+        </w:tc>
+      </w:tr>
+      <w:tr>
+        <w:trPr>
+          <w:trHeight w:val="576"/>
+          <w:jc w:val="center"/>
+        </w:trPr>
+        <w:tc>
+          <w:tcPr>
+            <w:tcW w:w="1931" w:type="dxa"/>
+          </w:tcPr>
+          <w:p>
+            <w:pPr>
+              <w:jc w:val="center"/>
+              <w:rPr>
+                <w:b/>
+                <w:bCs/>
+                <w:sz w:val="18"/>
+                <w:szCs w:val="18"/>
+              </w:rPr>
+            </w:pPr>
+            <w:r>
+              <w:rPr>
+                <w:b/>
+                <w:bCs/>
+                <w:sz w:val="18"/>
+                <w:szCs w:val="18"/>
+              </w:rPr>
+              <w:t>Elaborar proyectos innovadores que agreguen valor a contextos sociales y productivos, de acuerdo a las necesidades del entorno.</w:t>
+            </w:r>
+          </w:p>
+        </w:tc>
+        <w:tc>
+          <w:tcPr>
+            <w:tcW w:w="1017" w:type="dxa"/>
+          </w:tcPr>
+          <w:p>
+            <w:pPr>
+              <w:jc w:val="center"/>
+              <w:rPr>
+                <w:b/>
+                <w:bCs/>
+                <w:sz w:val="18"/>
+                <w:szCs w:val="18"/>
+              </w:rPr>
+            </w:pPr>
+          </w:p>
+        </w:tc>
+        <w:tc>
+          <w:tcPr>
+            <w:tcW w:w="926" w:type="dxa"/>
+          </w:tcPr>
+          <w:p>
+            <w:pPr>
+              <w:jc w:val="center"/>
+              <w:rPr>
+                <w:b/>
+                <w:bCs/>
+                <w:sz w:val="18"/>
+                <w:szCs w:val="18"/>
+              </w:rPr>
+            </w:pPr>
+          </w:p>
+        </w:tc>
+        <w:tc>
+          <w:tcPr>
+            <w:tcW w:w="1055" w:type="dxa"/>
+          </w:tcPr>
+          <w:p>
+            <w:pPr>
+              <w:jc w:val="center"/>
+              <w:rPr>
+                <w:b/>
+                <w:bCs/>
+                <w:sz w:val="18"/>
+                <w:szCs w:val="18"/>
+              </w:rPr>
+            </w:pPr>
+            <w:r>
+              <w:rPr>
+                <w:b/>
+                <w:bCs/>
+                <w:sz w:val="18"/>
+                <w:szCs w:val="18"/>
+              </w:rPr>
+              <w:t>X</w:t>
+            </w:r>
+          </w:p>
+        </w:tc>
+        <w:tc>
+          <w:tcPr>
+            <w:tcW w:w="1187" w:type="dxa"/>
+          </w:tcPr>
+          <w:p>
+            <w:pPr>
+              <w:jc w:val="center"/>
+              <w:rPr>
+                <w:b/>
+                <w:bCs/>
+                <w:sz w:val="18"/>
+                <w:szCs w:val="18"/>
+              </w:rPr>
+            </w:pPr>
+          </w:p>
+        </w:tc>
+        <w:tc>
+          <w:tcPr>
+            <w:tcW w:w="1250" w:type="dxa"/>
+          </w:tcPr>
+          <w:p>
+            <w:pPr>
+              <w:jc w:val="center"/>
+              <w:rPr>
+                <w:b/>
+                <w:bCs/>
+                <w:sz w:val="18"/>
+                <w:szCs w:val="18"/>
+              </w:rPr>
+            </w:pPr>
+          </w:p>
+        </w:tc>
+        <w:tc>
+          <w:tcPr>
+            <w:tcW w:w="2557" w:type="dxa"/>
+          </w:tcPr>
+          <w:p>
+            <w:pPr>
+              <w:jc w:val="center"/>
+              <w:rPr>
+                <w:b/>
+                <w:bCs/>
+                <w:sz w:val="18"/>
+                <w:szCs w:val="18"/>
+              </w:rPr>
+            </w:pPr>
+            <w:r>
+              <w:rPr>
+                <w:b/>
+                <w:bCs/>
+                <w:sz w:val="18"/>
+                <w:szCs w:val="18"/>
+              </w:rPr>
+              <w:t>Considero que crear proyectos innovadores actualmente es muy complicado y no suelo tener ideas tan creativas para dar soluciones a problemas generales.</w:t>
+            </w:r>
+          </w:p>
+        </w:tc>
+      </w:tr>
+      <w:tr>
+        <w:trPr>
+          <w:trHeight w:val="576"/>
+          <w:jc w:val="center"/>
+        </w:trPr>
+        <w:tc>
+          <w:tcPr>
+            <w:tcW w:w="1931" w:type="dxa"/>
+          </w:tcPr>
+          <w:p>
+            <w:pPr>
+              <w:jc w:val="center"/>
+              <w:rPr>
+                <w:b/>
+                <w:bCs/>
+                <w:sz w:val="18"/>
+                <w:szCs w:val="18"/>
+              </w:rPr>
+            </w:pPr>
+            <w:r>
+              <w:rPr>
+                <w:b/>
+                <w:bCs/>
+                <w:sz w:val="18"/>
+                <w:szCs w:val="18"/>
+              </w:rPr>
+              <w:t>Reconocer un desempeño correcto en situaciones de la profesión o especialidad en el área de la informática.</w:t>
+            </w:r>
+          </w:p>
+        </w:tc>
+        <w:tc>
+          <w:tcPr>
+            <w:tcW w:w="1017" w:type="dxa"/>
+          </w:tcPr>
+          <w:p>
+            <w:pPr>
+              <w:jc w:val="center"/>
+              <w:rPr>
+                <w:b/>
+                <w:bCs/>
+                <w:sz w:val="18"/>
+                <w:szCs w:val="18"/>
+              </w:rPr>
+            </w:pPr>
+          </w:p>
+        </w:tc>
+        <w:tc>
+          <w:tcPr>
+            <w:tcW w:w="926" w:type="dxa"/>
+          </w:tcPr>
+          <w:p>
+            <w:pPr>
+              <w:jc w:val="center"/>
+              <w:rPr>
+                <w:b/>
+                <w:bCs/>
+                <w:sz w:val="18"/>
+                <w:szCs w:val="18"/>
+              </w:rPr>
+            </w:pPr>
+            <w:r>
+              <w:rPr>
+                <w:b/>
+                <w:bCs/>
+                <w:sz w:val="18"/>
+                <w:szCs w:val="18"/>
+              </w:rPr>
+              <w:t>X</w:t>
+            </w:r>
+          </w:p>
+        </w:tc>
+        <w:tc>
+          <w:tcPr>
+            <w:tcW w:w="1055" w:type="dxa"/>
+          </w:tcPr>
+          <w:p>
+            <w:pPr>
+              <w:jc w:val="center"/>
+              <w:rPr>
+                <w:b/>
+                <w:bCs/>
+                <w:sz w:val="18"/>
+                <w:szCs w:val="18"/>
+              </w:rPr>
+            </w:pPr>
+          </w:p>
+        </w:tc>
+        <w:tc>
+          <w:tcPr>
+            <w:tcW w:w="1187" w:type="dxa"/>
+          </w:tcPr>
+          <w:p>
+            <w:pPr>
+              <w:jc w:val="center"/>
+              <w:rPr>
+                <w:b/>
+                <w:bCs/>
+                <w:sz w:val="18"/>
+                <w:szCs w:val="18"/>
+              </w:rPr>
+            </w:pPr>
+          </w:p>
+        </w:tc>
+        <w:tc>
+          <w:tcPr>
+            <w:tcW w:w="1250" w:type="dxa"/>
+          </w:tcPr>
+          <w:p>
+            <w:pPr>
+              <w:jc w:val="center"/>
+              <w:rPr>
+                <w:b/>
+                <w:bCs/>
+                <w:sz w:val="18"/>
+                <w:szCs w:val="18"/>
+              </w:rPr>
+            </w:pPr>
+          </w:p>
+        </w:tc>
+        <w:tc>
+          <w:tcPr>
+            <w:tcW w:w="2557" w:type="dxa"/>
+          </w:tcPr>
+          <w:p>
+            <w:pPr>
+              <w:jc w:val="center"/>
+              <w:rPr>
+                <w:b/>
+                <w:bCs/>
+                <w:sz w:val="18"/>
+                <w:szCs w:val="18"/>
+              </w:rPr>
+            </w:pPr>
+            <w:r>
+              <w:rPr>
+                <w:b/>
+                <w:bCs/>
+                <w:sz w:val="18"/>
+                <w:szCs w:val="18"/>
+              </w:rPr>
+              <w:t>Considero que tengo un desempeño bastante bueno, sin embargo por temas personales siento que no soy lo suficientemente bueno como para realmente desempeñarme de manera excelente.</w:t>
+            </w:r>
           </w:p>
         </w:tc>
       </w:tr>
@@ -2288,7 +4276,7 @@
 </file>
 
 <file path=word/endnotes.xml><?xml version="1.0" encoding="utf-8"?>
-<w:endnotes xmlns:wpc="http://schemas.microsoft.com/office/word/2010/wordprocessingCanvas" xmlns:cx="http://schemas.microsoft.com/office/drawing/2014/chartex" xmlns:cx1="http://schemas.microsoft.com/office/drawing/2015/9/8/chartex" xmlns:cx2="http://schemas.microsoft.com/office/drawing/2015/10/21/chartex" xmlns:cx3="http://schemas.microsoft.com/office/drawing/2016/5/9/chartex" xmlns:cx4="http://schemas.microsoft.com/office/drawing/2016/5/10/chartex" xmlns:cx5="http://schemas.microsoft.com/office/drawing/2016/5/11/chartex" xmlns:cx6="http://schemas.microsoft.com/office/drawing/2016/5/12/chartex" xmlns:cx7="http://schemas.microsoft.com/office/drawing/2016/5/13/chartex" xmlns:cx8="http://schemas.microsoft.com/office/drawing/2016/5/14/chartex" xmlns:mc="http://schemas.openxmlformats.org/markup-compatibility/2006" xmlns:aink="http://schemas.microsoft.com/office/drawing/2016/ink" xmlns:am3d="http://schemas.microsoft.com/office/drawing/2017/model3d" xmlns:o="urn:schemas-microsoft-com:office:office" xmlns:oel="http://schemas.microsoft.com/office/2019/extlst" xmlns:r="http://schemas.openxmlformats.org/officeDocument/2006/relationships" xmlns:m="http://schemas.openxmlformats.org/officeDocument/2006/math" xmlns:v="urn:schemas-microsoft-com:vml" xmlns:wp14="http://schemas.microsoft.com/office/word/2010/wordprocessingDrawing" xmlns:wp="http://schemas.openxmlformats.org/drawingml/2006/wordprocessingDrawing" xmlns:w10="urn:schemas-microsoft-com:office:word" xmlns:w="http://schemas.openxmlformats.org/wordprocessingml/2006/main" xmlns:w14="http://schemas.microsoft.com/office/word/2010/wordml" xmlns:w15="http://schemas.microsoft.com/office/word/2012/wordml" xmlns:w16cei="http://schemas.microsoft.com/office/word/2026/wordml/cei" xmlns:w16cex="http://schemas.microsoft.com/office/word/2018/wordml/cex" xmlns:w16cid="http://schemas.microsoft.com/office/word/2016/wordml/cid" xmlns:w16="http://schemas.microsoft.com/office/word/2018/wordml" xmlns:w16du="http://schemas.microsoft.com/office/word/2023/wordml/word16du" xmlns:w16sdtdh="http://schemas.microsoft.com/office/word/2020/wordml/sdtdatahash" xmlns:w16sdtfl="http://schemas.microsoft.com/office/word/2024/wordml/sdtformatlock" xmlns:w16se="http://schemas.microsoft.com/office/word/2015/wordml/symex" xmlns:wpg="http://schemas.microsoft.com/office/word/2010/wordprocessingGroup" xmlns:wpi="http://schemas.microsoft.com/office/word/2010/wordprocessingInk" xmlns:wne="http://schemas.microsoft.com/office/word/2006/wordml" xmlns:wps="http://schemas.microsoft.com/office/word/2010/wordprocessingShape" mc:Ignorable="w14 w15 w16se w16cid w16 w16cex w16sdtdh w16sdtfl w16du wp14">
+<w:endnotes xmlns:wpc="http://schemas.microsoft.com/office/word/2010/wordprocessingCanvas" xmlns:cx="http://schemas.microsoft.com/office/drawing/2014/chartex" xmlns:cx1="http://schemas.microsoft.com/office/drawing/2015/9/8/chartex" xmlns:cx2="http://schemas.microsoft.com/office/drawing/2015/10/21/chartex" xmlns:cx3="http://schemas.microsoft.com/office/drawing/2016/5/9/chartex" xmlns:cx4="http://schemas.microsoft.com/office/drawing/2016/5/10/chartex" xmlns:cx5="http://schemas.microsoft.com/office/drawing/2016/5/11/chartex" xmlns:cx6="http://schemas.microsoft.com/office/drawing/2016/5/12/chartex" xmlns:cx7="http://schemas.microsoft.com/office/drawing/2016/5/13/chartex" xmlns:cx8="http://schemas.microsoft.com/office/drawing/2016/5/14/chartex" xmlns:mc="http://schemas.openxmlformats.org/markup-compatibility/2006" xmlns:aink="http://schemas.microsoft.com/office/drawing/2016/ink" xmlns:am3d="http://schemas.microsoft.com/office/drawing/2017/model3d" xmlns:o="urn:schemas-microsoft-com:office:office" xmlns:oel="http://schemas.microsoft.com/office/2019/extlst" xmlns:r="http://schemas.openxmlformats.org/officeDocument/2006/relationships" xmlns:m="http://schemas.openxmlformats.org/officeDocument/2006/math" xmlns:v="urn:schemas-microsoft-com:vml" xmlns:wp14="http://schemas.microsoft.com/office/word/2010/wordprocessingDrawing" xmlns:wp="http://schemas.openxmlformats.org/drawingml/2006/wordprocessingDrawing" xmlns:w10="urn:schemas-microsoft-com:office:word" xmlns:w="http://schemas.openxmlformats.org/wordprocessingml/2006/main" xmlns:w14="http://schemas.microsoft.com/office/word/2010/wordml" xmlns:w15="http://schemas.microsoft.com/office/word/2012/wordml" xmlns:w16cex="http://schemas.microsoft.com/office/word/2018/wordml/cex" xmlns:w16cid="http://schemas.microsoft.com/office/word/2016/wordml/cid" xmlns:w16="http://schemas.microsoft.com/office/word/2018/wordml" xmlns:w16du="http://schemas.microsoft.com/office/word/2023/wordml/word16du" xmlns:w16sdtdh="http://schemas.microsoft.com/office/word/2020/wordml/sdtdatahash" xmlns:w16sdtfl="http://schemas.microsoft.com/office/word/2024/wordml/sdtformatlock" xmlns:w16se="http://schemas.microsoft.com/office/word/2015/wordml/symex" xmlns:wpg="http://schemas.microsoft.com/office/word/2010/wordprocessingGroup" xmlns:wpi="http://schemas.microsoft.com/office/word/2010/wordprocessingInk" xmlns:wne="http://schemas.microsoft.com/office/word/2006/wordml" xmlns:wps="http://schemas.microsoft.com/office/word/2010/wordprocessingShape" mc:Ignorable="w14 w15 w16se w16cid w16 w16cex w16sdtdh w16sdtfl w16du wp14">
   <w:endnote w:type="separator" w:id="-1">
     <w:p>
       <w:pPr>
@@ -2313,7 +4301,7 @@
 </file>
 
 <file path=word/footer1.xml><?xml version="1.0" encoding="utf-8"?>
-<w:ftr xmlns:wpc="http://schemas.microsoft.com/office/word/2010/wordprocessingCanvas" xmlns:cx="http://schemas.microsoft.com/office/drawing/2014/chartex" xmlns:cx1="http://schemas.microsoft.com/office/drawing/2015/9/8/chartex" xmlns:cx2="http://schemas.microsoft.com/office/drawing/2015/10/21/chartex" xmlns:cx3="http://schemas.microsoft.com/office/drawing/2016/5/9/chartex" xmlns:cx4="http://schemas.microsoft.com/office/drawing/2016/5/10/chartex" xmlns:cx5="http://schemas.microsoft.com/office/drawing/2016/5/11/chartex" xmlns:cx6="http://schemas.microsoft.com/office/drawing/2016/5/12/chartex" xmlns:cx7="http://schemas.microsoft.com/office/drawing/2016/5/13/chartex" xmlns:cx8="http://schemas.microsoft.com/office/drawing/2016/5/14/chartex" xmlns:mc="http://schemas.openxmlformats.org/markup-compatibility/2006" xmlns:aink="http://schemas.microsoft.com/office/drawing/2016/ink" xmlns:am3d="http://schemas.microsoft.com/office/drawing/2017/model3d" xmlns:o="urn:schemas-microsoft-com:office:office" xmlns:oel="http://schemas.microsoft.com/office/2019/extlst" xmlns:r="http://schemas.openxmlformats.org/officeDocument/2006/relationships" xmlns:m="http://schemas.openxmlformats.org/officeDocument/2006/math" xmlns:v="urn:schemas-microsoft-com:vml" xmlns:wp14="http://schemas.microsoft.com/office/word/2010/wordprocessingDrawing" xmlns:wp="http://schemas.openxmlformats.org/drawingml/2006/wordprocessingDrawing" xmlns:w10="urn:schemas-microsoft-com:office:word" xmlns:w="http://schemas.openxmlformats.org/wordprocessingml/2006/main" xmlns:w14="http://schemas.microsoft.com/office/word/2010/wordml" xmlns:w15="http://schemas.microsoft.com/office/word/2012/wordml" xmlns:w16cei="http://schemas.microsoft.com/office/word/2026/wordml/cei" xmlns:w16cex="http://schemas.microsoft.com/office/word/2018/wordml/cex" xmlns:w16cid="http://schemas.microsoft.com/office/word/2016/wordml/cid" xmlns:w16="http://schemas.microsoft.com/office/word/2018/wordml" xmlns:w16du="http://schemas.microsoft.com/office/word/2023/wordml/word16du" xmlns:w16sdtdh="http://schemas.microsoft.com/office/word/2020/wordml/sdtdatahash" xmlns:w16sdtfl="http://schemas.microsoft.com/office/word/2024/wordml/sdtformatlock" xmlns:w16se="http://schemas.microsoft.com/office/word/2015/wordml/symex" xmlns:wpg="http://schemas.microsoft.com/office/word/2010/wordprocessingGroup" xmlns:wpi="http://schemas.microsoft.com/office/word/2010/wordprocessingInk" xmlns:wne="http://schemas.microsoft.com/office/word/2006/wordml" xmlns:wps="http://schemas.microsoft.com/office/word/2010/wordprocessingShape" mc:Ignorable="w14 w15 w16se w16cid w16 w16cex w16sdtdh w16sdtfl w16du wp14">
+<w:ftr xmlns:wpc="http://schemas.microsoft.com/office/word/2010/wordprocessingCanvas" xmlns:cx="http://schemas.microsoft.com/office/drawing/2014/chartex" xmlns:cx1="http://schemas.microsoft.com/office/drawing/2015/9/8/chartex" xmlns:cx2="http://schemas.microsoft.com/office/drawing/2015/10/21/chartex" xmlns:cx3="http://schemas.microsoft.com/office/drawing/2016/5/9/chartex" xmlns:cx4="http://schemas.microsoft.com/office/drawing/2016/5/10/chartex" xmlns:cx5="http://schemas.microsoft.com/office/drawing/2016/5/11/chartex" xmlns:cx6="http://schemas.microsoft.com/office/drawing/2016/5/12/chartex" xmlns:cx7="http://schemas.microsoft.com/office/drawing/2016/5/13/chartex" xmlns:cx8="http://schemas.microsoft.com/office/drawing/2016/5/14/chartex" xmlns:mc="http://schemas.openxmlformats.org/markup-compatibility/2006" xmlns:aink="http://schemas.microsoft.com/office/drawing/2016/ink" xmlns:am3d="http://schemas.microsoft.com/office/drawing/2017/model3d" xmlns:o="urn:schemas-microsoft-com:office:office" xmlns:oel="http://schemas.microsoft.com/office/2019/extlst" xmlns:r="http://schemas.openxmlformats.org/officeDocument/2006/relationships" xmlns:m="http://schemas.openxmlformats.org/officeDocument/2006/math" xmlns:v="urn:schemas-microsoft-com:vml" xmlns:wp14="http://schemas.microsoft.com/office/word/2010/wordprocessingDrawing" xmlns:wp="http://schemas.openxmlformats.org/drawingml/2006/wordprocessingDrawing" xmlns:w10="urn:schemas-microsoft-com:office:word" xmlns:w="http://schemas.openxmlformats.org/wordprocessingml/2006/main" xmlns:w14="http://schemas.microsoft.com/office/word/2010/wordml" xmlns:w15="http://schemas.microsoft.com/office/word/2012/wordml" xmlns:w16cex="http://schemas.microsoft.com/office/word/2018/wordml/cex" xmlns:w16cid="http://schemas.microsoft.com/office/word/2016/wordml/cid" xmlns:w16="http://schemas.microsoft.com/office/word/2018/wordml" xmlns:w16du="http://schemas.microsoft.com/office/word/2023/wordml/word16du" xmlns:w16sdtdh="http://schemas.microsoft.com/office/word/2020/wordml/sdtdatahash" xmlns:w16sdtfl="http://schemas.microsoft.com/office/word/2024/wordml/sdtformatlock" xmlns:w16se="http://schemas.microsoft.com/office/word/2015/wordml/symex" xmlns:wpg="http://schemas.microsoft.com/office/word/2010/wordprocessingGroup" xmlns:wpi="http://schemas.microsoft.com/office/word/2010/wordprocessingInk" xmlns:wne="http://schemas.microsoft.com/office/word/2006/wordml" xmlns:wps="http://schemas.microsoft.com/office/word/2010/wordprocessingShape" mc:Ignorable="w14 w15 w16se w16cid w16 w16cex w16sdtdh w16sdtfl w16du wp14">
   <w:p>
     <w:pPr>
       <w:pStyle w:val="Piedepgina"/>
@@ -2323,7 +4311,7 @@
 </file>
 
 <file path=word/footer2.xml><?xml version="1.0" encoding="utf-8"?>
-<w:ftr xmlns:wpc="http://schemas.microsoft.com/office/word/2010/wordprocessingCanvas" xmlns:cx="http://schemas.microsoft.com/office/drawing/2014/chartex" xmlns:cx1="http://schemas.microsoft.com/office/drawing/2015/9/8/chartex" xmlns:cx2="http://schemas.microsoft.com/office/drawing/2015/10/21/chartex" xmlns:cx3="http://schemas.microsoft.com/office/drawing/2016/5/9/chartex" xmlns:cx4="http://schemas.microsoft.com/office/drawing/2016/5/10/chartex" xmlns:cx5="http://schemas.microsoft.com/office/drawing/2016/5/11/chartex" xmlns:cx6="http://schemas.microsoft.com/office/drawing/2016/5/12/chartex" xmlns:cx7="http://schemas.microsoft.com/office/drawing/2016/5/13/chartex" xmlns:cx8="http://schemas.microsoft.com/office/drawing/2016/5/14/chartex" xmlns:mc="http://schemas.openxmlformats.org/markup-compatibility/2006" xmlns:aink="http://schemas.microsoft.com/office/drawing/2016/ink" xmlns:am3d="http://schemas.microsoft.com/office/drawing/2017/model3d" xmlns:o="urn:schemas-microsoft-com:office:office" xmlns:oel="http://schemas.microsoft.com/office/2019/extlst" xmlns:r="http://schemas.openxmlformats.org/officeDocument/2006/relationships" xmlns:m="http://schemas.openxmlformats.org/officeDocument/2006/math" xmlns:v="urn:schemas-microsoft-com:vml" xmlns:wp14="http://schemas.microsoft.com/office/word/2010/wordprocessingDrawing" xmlns:wp="http://schemas.openxmlformats.org/drawingml/2006/wordprocessingDrawing" xmlns:w10="urn:schemas-microsoft-com:office:word" xmlns:w="http://schemas.openxmlformats.org/wordprocessingml/2006/main" xmlns:w14="http://schemas.microsoft.com/office/word/2010/wordml" xmlns:w15="http://schemas.microsoft.com/office/word/2012/wordml" xmlns:w16cei="http://schemas.microsoft.com/office/word/2026/wordml/cei" xmlns:w16cex="http://schemas.microsoft.com/office/word/2018/wordml/cex" xmlns:w16cid="http://schemas.microsoft.com/office/word/2016/wordml/cid" xmlns:w16="http://schemas.microsoft.com/office/word/2018/wordml" xmlns:w16du="http://schemas.microsoft.com/office/word/2023/wordml/word16du" xmlns:w16sdtdh="http://schemas.microsoft.com/office/word/2020/wordml/sdtdatahash" xmlns:w16sdtfl="http://schemas.microsoft.com/office/word/2024/wordml/sdtformatlock" xmlns:w16se="http://schemas.microsoft.com/office/word/2015/wordml/symex" xmlns:wpg="http://schemas.microsoft.com/office/word/2010/wordprocessingGroup" xmlns:wpi="http://schemas.microsoft.com/office/word/2010/wordprocessingInk" xmlns:wne="http://schemas.microsoft.com/office/word/2006/wordml" xmlns:wps="http://schemas.microsoft.com/office/word/2010/wordprocessingShape" mc:Ignorable="w14 w15 w16se w16cid w16 w16cex w16sdtdh w16sdtfl w16du wp14">
+<w:ftr xmlns:wpc="http://schemas.microsoft.com/office/word/2010/wordprocessingCanvas" xmlns:cx="http://schemas.microsoft.com/office/drawing/2014/chartex" xmlns:cx1="http://schemas.microsoft.com/office/drawing/2015/9/8/chartex" xmlns:cx2="http://schemas.microsoft.com/office/drawing/2015/10/21/chartex" xmlns:cx3="http://schemas.microsoft.com/office/drawing/2016/5/9/chartex" xmlns:cx4="http://schemas.microsoft.com/office/drawing/2016/5/10/chartex" xmlns:cx5="http://schemas.microsoft.com/office/drawing/2016/5/11/chartex" xmlns:cx6="http://schemas.microsoft.com/office/drawing/2016/5/12/chartex" xmlns:cx7="http://schemas.microsoft.com/office/drawing/2016/5/13/chartex" xmlns:cx8="http://schemas.microsoft.com/office/drawing/2016/5/14/chartex" xmlns:mc="http://schemas.openxmlformats.org/markup-compatibility/2006" xmlns:aink="http://schemas.microsoft.com/office/drawing/2016/ink" xmlns:am3d="http://schemas.microsoft.com/office/drawing/2017/model3d" xmlns:o="urn:schemas-microsoft-com:office:office" xmlns:oel="http://schemas.microsoft.com/office/2019/extlst" xmlns:r="http://schemas.openxmlformats.org/officeDocument/2006/relationships" xmlns:m="http://schemas.openxmlformats.org/officeDocument/2006/math" xmlns:v="urn:schemas-microsoft-com:vml" xmlns:wp14="http://schemas.microsoft.com/office/word/2010/wordprocessingDrawing" xmlns:wp="http://schemas.openxmlformats.org/drawingml/2006/wordprocessingDrawing" xmlns:w10="urn:schemas-microsoft-com:office:word" xmlns:w="http://schemas.openxmlformats.org/wordprocessingml/2006/main" xmlns:w14="http://schemas.microsoft.com/office/word/2010/wordml" xmlns:w15="http://schemas.microsoft.com/office/word/2012/wordml" xmlns:w16cex="http://schemas.microsoft.com/office/word/2018/wordml/cex" xmlns:w16cid="http://schemas.microsoft.com/office/word/2016/wordml/cid" xmlns:w16="http://schemas.microsoft.com/office/word/2018/wordml" xmlns:w16du="http://schemas.microsoft.com/office/word/2023/wordml/word16du" xmlns:w16sdtdh="http://schemas.microsoft.com/office/word/2020/wordml/sdtdatahash" xmlns:w16sdtfl="http://schemas.microsoft.com/office/word/2024/wordml/sdtformatlock" xmlns:w16se="http://schemas.microsoft.com/office/word/2015/wordml/symex" xmlns:wpg="http://schemas.microsoft.com/office/word/2010/wordprocessingGroup" xmlns:wpi="http://schemas.microsoft.com/office/word/2010/wordprocessingInk" xmlns:wne="http://schemas.microsoft.com/office/word/2006/wordml" xmlns:wps="http://schemas.microsoft.com/office/word/2010/wordprocessingShape" mc:Ignorable="w14 w15 w16se w16cid w16 w16cex w16sdtdh w16sdtfl w16du wp14">
   <w:sdt>
     <w:sdtPr>
       <w:id w:val="-1904276369"/>
@@ -2541,14 +4529,14 @@
                 </wp:anchor>
               </w:drawing>
             </mc:Choice>
-            <mc:Fallback xmlns:a14="http://schemas.microsoft.com/office/drawing/2010/main" xmlns:a="http://schemas.openxmlformats.org/drawingml/2006/main">
+            <mc:Fallback>
               <w:pict>
-                <v:group id="Grupo 32" style="position:absolute;margin-left:0;margin-top:0;width:610.5pt;height:15pt;z-index:251659264;mso-width-percent:1000;mso-position-horizontal:center;mso-position-horizontal-relative:page;mso-position-vertical:center;mso-position-vertical-relative:bottom-margin-area;mso-width-percent:1000" coordsize="12255,300" coordorigin=",14970" o:spid="_x0000_s1026" w14:anchorId="51D00065" o:gfxdata="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">
+                <v:group w14:anchorId="51D00065" id="Grupo 32" o:spid="_x0000_s1026" style="position:absolute;margin-left:0;margin-top:0;width:610.5pt;height:15pt;z-index:251659264;mso-width-percent:1000;mso-position-horizontal:center;mso-position-horizontal-relative:page;mso-position-vertical:center;mso-position-vertical-relative:bottom-margin-area;mso-width-percent:1000" coordorigin=",14970" coordsize="12255,300" o:gfxdata="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">
                   <v:shapetype id="_x0000_t202" coordsize="21600,21600" o:spt="202" path="m,l,21600r21600,l21600,xe">
                     <v:stroke joinstyle="miter"/>
                     <v:path gradientshapeok="t" o:connecttype="rect"/>
                   </v:shapetype>
-                  <v:shape id="Text Box 25" style="position:absolute;left:10803;top:14982;width:659;height:288;visibility:visible;mso-wrap-style:square;v-text-anchor:top" o:spid="_x0000_s1027" filled="f" stroked="f" type="#_x0000_t202" o:gfxdata="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">
+                  <v:shape id="Text Box 25" o:spid="_x0000_s1027" type="#_x0000_t202" style="position:absolute;left:10803;top:14982;width:659;height:288;visibility:visible;mso-wrap-style:square;v-text-anchor:top" o:gfxdata="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" filled="f" stroked="f">
                     <v:textbox inset="0,0,0,0">
                       <w:txbxContent>
                         <w:p>
@@ -2582,20 +4570,20 @@
                       </w:txbxContent>
                     </v:textbox>
                   </v:shape>
-                  <v:group id="Group 31" style="position:absolute;top:14970;width:12255;height:230;flip:x" coordsize="12255,230" coordorigin="-8,14978" o:spid="_x0000_s1028" o:gfxdata="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">
-                    <v:shapetype id="_x0000_t34" coordsize="21600,21600" o:oned="t" filled="f" o:spt="34" adj="10800" path="m,l@0,0@0,21600,21600,21600e">
+                  <v:group id="Group 31" o:spid="_x0000_s1028" style="position:absolute;top:14970;width:12255;height:230;flip:x" coordorigin="-8,14978" coordsize="12255,230" o:gfxdata="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">
+                    <v:shapetype id="_x0000_t34" coordsize="21600,21600" o:spt="34" o:oned="t" adj="10800" path="m,l@0,0@0,21600,21600,21600e" filled="f">
                       <v:stroke joinstyle="miter"/>
                       <v:formulas>
                         <v:f eqn="val #0"/>
                       </v:formulas>
-                      <v:path fillok="f" arrowok="t" o:connecttype="none"/>
+                      <v:path arrowok="t" fillok="f" o:connecttype="none"/>
                       <v:handles>
                         <v:h position="#0,center"/>
                       </v:handles>
                       <o:lock v:ext="edit" shapetype="t"/>
                     </v:shapetype>
-                    <v:shape id="AutoShape 27" style="position:absolute;left:-8;top:14978;width:1260;height:230;flip:y;visibility:visible;mso-wrap-style:square" o:spid="_x0000_s1029" strokecolor="#a5a5a5" o:connectortype="elbow" type="#_x0000_t34" o:gfxdata="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"/>
-                    <v:shape id="AutoShape 28" style="position:absolute;left:1252;top:14978;width:10995;height:230;rotation:180;visibility:visible;mso-wrap-style:square" o:spid="_x0000_s1030" strokecolor="#a5a5a5" o:connectortype="elbow" type="#_x0000_t34" adj="20904" o:gfxdata="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"/>
+                    <v:shape id="AutoShape 27" o:spid="_x0000_s1029" type="#_x0000_t34" style="position:absolute;left:-8;top:14978;width:1260;height:230;flip:y;visibility:visible;mso-wrap-style:square" o:connectortype="elbow" o:gfxdata="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" strokecolor="#a5a5a5"/>
+                    <v:shape id="AutoShape 28" o:spid="_x0000_s1030" type="#_x0000_t34" style="position:absolute;left:1252;top:14978;width:10995;height:230;rotation:180;visibility:visible;mso-wrap-style:square" o:connectortype="elbow" o:gfxdata="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" adj="20904" strokecolor="#a5a5a5"/>
                   </v:group>
                   <w10:wrap anchorx="page" anchory="margin"/>
                 </v:group>
@@ -2610,7 +4598,7 @@
 </file>
 
 <file path=word/footer3.xml><?xml version="1.0" encoding="utf-8"?>
-<w:ftr xmlns:wpc="http://schemas.microsoft.com/office/word/2010/wordprocessingCanvas" xmlns:cx="http://schemas.microsoft.com/office/drawing/2014/chartex" xmlns:cx1="http://schemas.microsoft.com/office/drawing/2015/9/8/chartex" xmlns:cx2="http://schemas.microsoft.com/office/drawing/2015/10/21/chartex" xmlns:cx3="http://schemas.microsoft.com/office/drawing/2016/5/9/chartex" xmlns:cx4="http://schemas.microsoft.com/office/drawing/2016/5/10/chartex" xmlns:cx5="http://schemas.microsoft.com/office/drawing/2016/5/11/chartex" xmlns:cx6="http://schemas.microsoft.com/office/drawing/2016/5/12/chartex" xmlns:cx7="http://schemas.microsoft.com/office/drawing/2016/5/13/chartex" xmlns:cx8="http://schemas.microsoft.com/office/drawing/2016/5/14/chartex" xmlns:mc="http://schemas.openxmlformats.org/markup-compatibility/2006" xmlns:aink="http://schemas.microsoft.com/office/drawing/2016/ink" xmlns:am3d="http://schemas.microsoft.com/office/drawing/2017/model3d" xmlns:o="urn:schemas-microsoft-com:office:office" xmlns:oel="http://schemas.microsoft.com/office/2019/extlst" xmlns:r="http://schemas.openxmlformats.org/officeDocument/2006/relationships" xmlns:m="http://schemas.openxmlformats.org/officeDocument/2006/math" xmlns:v="urn:schemas-microsoft-com:vml" xmlns:wp14="http://schemas.microsoft.com/office/word/2010/wordprocessingDrawing" xmlns:wp="http://schemas.openxmlformats.org/drawingml/2006/wordprocessingDrawing" xmlns:w10="urn:schemas-microsoft-com:office:word" xmlns:w="http://schemas.openxmlformats.org/wordprocessingml/2006/main" xmlns:w14="http://schemas.microsoft.com/office/word/2010/wordml" xmlns:w15="http://schemas.microsoft.com/office/word/2012/wordml" xmlns:w16cei="http://schemas.microsoft.com/office/word/2026/wordml/cei" xmlns:w16cex="http://schemas.microsoft.com/office/word/2018/wordml/cex" xmlns:w16cid="http://schemas.microsoft.com/office/word/2016/wordml/cid" xmlns:w16="http://schemas.microsoft.com/office/word/2018/wordml" xmlns:w16du="http://schemas.microsoft.com/office/word/2023/wordml/word16du" xmlns:w16sdtdh="http://schemas.microsoft.com/office/word/2020/wordml/sdtdatahash" xmlns:w16sdtfl="http://schemas.microsoft.com/office/word/2024/wordml/sdtformatlock" xmlns:w16se="http://schemas.microsoft.com/office/word/2015/wordml/symex" xmlns:wpg="http://schemas.microsoft.com/office/word/2010/wordprocessingGroup" xmlns:wpi="http://schemas.microsoft.com/office/word/2010/wordprocessingInk" xmlns:wne="http://schemas.microsoft.com/office/word/2006/wordml" xmlns:wps="http://schemas.microsoft.com/office/word/2010/wordprocessingShape" mc:Ignorable="w14 w15 w16se w16cid w16 w16cex w16sdtdh w16sdtfl w16du wp14">
+<w:ftr xmlns:wpc="http://schemas.microsoft.com/office/word/2010/wordprocessingCanvas" xmlns:cx="http://schemas.microsoft.com/office/drawing/2014/chartex" xmlns:cx1="http://schemas.microsoft.com/office/drawing/2015/9/8/chartex" xmlns:cx2="http://schemas.microsoft.com/office/drawing/2015/10/21/chartex" xmlns:cx3="http://schemas.microsoft.com/office/drawing/2016/5/9/chartex" xmlns:cx4="http://schemas.microsoft.com/office/drawing/2016/5/10/chartex" xmlns:cx5="http://schemas.microsoft.com/office/drawing/2016/5/11/chartex" xmlns:cx6="http://schemas.microsoft.com/office/drawing/2016/5/12/chartex" xmlns:cx7="http://schemas.microsoft.com/office/drawing/2016/5/13/chartex" xmlns:cx8="http://schemas.microsoft.com/office/drawing/2016/5/14/chartex" xmlns:mc="http://schemas.openxmlformats.org/markup-compatibility/2006" xmlns:aink="http://schemas.microsoft.com/office/drawing/2016/ink" xmlns:am3d="http://schemas.microsoft.com/office/drawing/2017/model3d" xmlns:o="urn:schemas-microsoft-com:office:office" xmlns:oel="http://schemas.microsoft.com/office/2019/extlst" xmlns:r="http://schemas.openxmlformats.org/officeDocument/2006/relationships" xmlns:m="http://schemas.openxmlformats.org/officeDocument/2006/math" xmlns:v="urn:schemas-microsoft-com:vml" xmlns:wp14="http://schemas.microsoft.com/office/word/2010/wordprocessingDrawing" xmlns:wp="http://schemas.openxmlformats.org/drawingml/2006/wordprocessingDrawing" xmlns:w10="urn:schemas-microsoft-com:office:word" xmlns:w="http://schemas.openxmlformats.org/wordprocessingml/2006/main" xmlns:w14="http://schemas.microsoft.com/office/word/2010/wordml" xmlns:w15="http://schemas.microsoft.com/office/word/2012/wordml" xmlns:w16cex="http://schemas.microsoft.com/office/word/2018/wordml/cex" xmlns:w16cid="http://schemas.microsoft.com/office/word/2016/wordml/cid" xmlns:w16="http://schemas.microsoft.com/office/word/2018/wordml" xmlns:w16du="http://schemas.microsoft.com/office/word/2023/wordml/word16du" xmlns:w16sdtdh="http://schemas.microsoft.com/office/word/2020/wordml/sdtdatahash" xmlns:w16sdtfl="http://schemas.microsoft.com/office/word/2024/wordml/sdtformatlock" xmlns:w16se="http://schemas.microsoft.com/office/word/2015/wordml/symex" xmlns:wpg="http://schemas.microsoft.com/office/word/2010/wordprocessingGroup" xmlns:wpi="http://schemas.microsoft.com/office/word/2010/wordprocessingInk" xmlns:wne="http://schemas.microsoft.com/office/word/2006/wordml" xmlns:wps="http://schemas.microsoft.com/office/word/2010/wordprocessingShape" mc:Ignorable="w14 w15 w16se w16cid w16 w16cex w16sdtdh w16sdtfl w16du wp14">
   <w:p>
     <w:pPr>
       <w:pStyle w:val="Piedepgina"/>
@@ -2620,7 +4608,7 @@
 </file>
 
 <file path=word/footnotes.xml><?xml version="1.0" encoding="utf-8"?>
-<w:footnotes xmlns:wpc="http://schemas.microsoft.com/office/word/2010/wordprocessingCanvas" xmlns:cx="http://schemas.microsoft.com/office/drawing/2014/chartex" xmlns:cx1="http://schemas.microsoft.com/office/drawing/2015/9/8/chartex" xmlns:cx2="http://schemas.microsoft.com/office/drawing/2015/10/21/chartex" xmlns:cx3="http://schemas.microsoft.com/office/drawing/2016/5/9/chartex" xmlns:cx4="http://schemas.microsoft.com/office/drawing/2016/5/10/chartex" xmlns:cx5="http://schemas.microsoft.com/office/drawing/2016/5/11/chartex" xmlns:cx6="http://schemas.microsoft.com/office/drawing/2016/5/12/chartex" xmlns:cx7="http://schemas.microsoft.com/office/drawing/2016/5/13/chartex" xmlns:cx8="http://schemas.microsoft.com/office/drawing/2016/5/14/chartex" xmlns:mc="http://schemas.openxmlformats.org/markup-compatibility/2006" xmlns:aink="http://schemas.microsoft.com/office/drawing/2016/ink" xmlns:am3d="http://schemas.microsoft.com/office/drawing/2017/model3d" xmlns:o="urn:schemas-microsoft-com:office:office" xmlns:oel="http://schemas.microsoft.com/office/2019/extlst" xmlns:r="http://schemas.openxmlformats.org/officeDocument/2006/relationships" xmlns:m="http://schemas.openxmlformats.org/officeDocument/2006/math" xmlns:v="urn:schemas-microsoft-com:vml" xmlns:wp14="http://schemas.microsoft.com/office/word/2010/wordprocessingDrawing" xmlns:wp="http://schemas.openxmlformats.org/drawingml/2006/wordprocessingDrawing" xmlns:w10="urn:schemas-microsoft-com:office:word" xmlns:w="http://schemas.openxmlformats.org/wordprocessingml/2006/main" xmlns:w14="http://schemas.microsoft.com/office/word/2010/wordml" xmlns:w15="http://schemas.microsoft.com/office/word/2012/wordml" xmlns:w16cei="http://schemas.microsoft.com/office/word/2026/wordml/cei" xmlns:w16cex="http://schemas.microsoft.com/office/word/2018/wordml/cex" xmlns:w16cid="http://schemas.microsoft.com/office/word/2016/wordml/cid" xmlns:w16="http://schemas.microsoft.com/office/word/2018/wordml" xmlns:w16du="http://schemas.microsoft.com/office/word/2023/wordml/word16du" xmlns:w16sdtdh="http://schemas.microsoft.com/office/word/2020/wordml/sdtdatahash" xmlns:w16sdtfl="http://schemas.microsoft.com/office/word/2024/wordml/sdtformatlock" xmlns:w16se="http://schemas.microsoft.com/office/word/2015/wordml/symex" xmlns:wpg="http://schemas.microsoft.com/office/word/2010/wordprocessingGroup" xmlns:wpi="http://schemas.microsoft.com/office/word/2010/wordprocessingInk" xmlns:wne="http://schemas.microsoft.com/office/word/2006/wordml" xmlns:wps="http://schemas.microsoft.com/office/word/2010/wordprocessingShape" mc:Ignorable="w14 w15 w16se w16cid w16 w16cex w16sdtdh w16sdtfl w16du wp14">
+<w:footnotes xmlns:wpc="http://schemas.microsoft.com/office/word/2010/wordprocessingCanvas" xmlns:cx="http://schemas.microsoft.com/office/drawing/2014/chartex" xmlns:cx1="http://schemas.microsoft.com/office/drawing/2015/9/8/chartex" xmlns:cx2="http://schemas.microsoft.com/office/drawing/2015/10/21/chartex" xmlns:cx3="http://schemas.microsoft.com/office/drawing/2016/5/9/chartex" xmlns:cx4="http://schemas.microsoft.com/office/drawing/2016/5/10/chartex" xmlns:cx5="http://schemas.microsoft.com/office/drawing/2016/5/11/chartex" xmlns:cx6="http://schemas.microsoft.com/office/drawing/2016/5/12/chartex" xmlns:cx7="http://schemas.microsoft.com/office/drawing/2016/5/13/chartex" xmlns:cx8="http://schemas.microsoft.com/office/drawing/2016/5/14/chartex" xmlns:mc="http://schemas.openxmlformats.org/markup-compatibility/2006" xmlns:aink="http://schemas.microsoft.com/office/drawing/2016/ink" xmlns:am3d="http://schemas.microsoft.com/office/drawing/2017/model3d" xmlns:o="urn:schemas-microsoft-com:office:office" xmlns:oel="http://schemas.microsoft.com/office/2019/extlst" xmlns:r="http://schemas.openxmlformats.org/officeDocument/2006/relationships" xmlns:m="http://schemas.openxmlformats.org/officeDocument/2006/math" xmlns:v="urn:schemas-microsoft-com:vml" xmlns:wp14="http://schemas.microsoft.com/office/word/2010/wordprocessingDrawing" xmlns:wp="http://schemas.openxmlformats.org/drawingml/2006/wordprocessingDrawing" xmlns:w10="urn:schemas-microsoft-com:office:word" xmlns:w="http://schemas.openxmlformats.org/wordprocessingml/2006/main" xmlns:w14="http://schemas.microsoft.com/office/word/2010/wordml" xmlns:w15="http://schemas.microsoft.com/office/word/2012/wordml" xmlns:w16cex="http://schemas.microsoft.com/office/word/2018/wordml/cex" xmlns:w16cid="http://schemas.microsoft.com/office/word/2016/wordml/cid" xmlns:w16="http://schemas.microsoft.com/office/word/2018/wordml" xmlns:w16du="http://schemas.microsoft.com/office/word/2023/wordml/word16du" xmlns:w16sdtdh="http://schemas.microsoft.com/office/word/2020/wordml/sdtdatahash" xmlns:w16sdtfl="http://schemas.microsoft.com/office/word/2024/wordml/sdtformatlock" xmlns:w16se="http://schemas.microsoft.com/office/word/2015/wordml/symex" xmlns:wpg="http://schemas.microsoft.com/office/word/2010/wordprocessingGroup" xmlns:wpi="http://schemas.microsoft.com/office/word/2010/wordprocessingInk" xmlns:wne="http://schemas.microsoft.com/office/word/2006/wordml" xmlns:wps="http://schemas.microsoft.com/office/word/2010/wordprocessingShape" mc:Ignorable="w14 w15 w16se w16cid w16 w16cex w16sdtdh w16sdtfl w16du wp14">
   <w:footnote w:type="separator" w:id="-1">
     <w:p>
       <w:pPr>
@@ -2645,7 +4633,7 @@
 </file>
 
 <file path=word/header1.xml><?xml version="1.0" encoding="utf-8"?>
-<w:hdr xmlns:wpc="http://schemas.microsoft.com/office/word/2010/wordprocessingCanvas" xmlns:cx="http://schemas.microsoft.com/office/drawing/2014/chartex" xmlns:cx1="http://schemas.microsoft.com/office/drawing/2015/9/8/chartex" xmlns:cx2="http://schemas.microsoft.com/office/drawing/2015/10/21/chartex" xmlns:cx3="http://schemas.microsoft.com/office/drawing/2016/5/9/chartex" xmlns:cx4="http://schemas.microsoft.com/office/drawing/2016/5/10/chartex" xmlns:cx5="http://schemas.microsoft.com/office/drawing/2016/5/11/chartex" xmlns:cx6="http://schemas.microsoft.com/office/drawing/2016/5/12/chartex" xmlns:cx7="http://schemas.microsoft.com/office/drawing/2016/5/13/chartex" xmlns:cx8="http://schemas.microsoft.com/office/drawing/2016/5/14/chartex" xmlns:mc="http://schemas.openxmlformats.org/markup-compatibility/2006" xmlns:aink="http://schemas.microsoft.com/office/drawing/2016/ink" xmlns:am3d="http://schemas.microsoft.com/office/drawing/2017/model3d" xmlns:o="urn:schemas-microsoft-com:office:office" xmlns:oel="http://schemas.microsoft.com/office/2019/extlst" xmlns:r="http://schemas.openxmlformats.org/officeDocument/2006/relationships" xmlns:m="http://schemas.openxmlformats.org/officeDocument/2006/math" xmlns:v="urn:schemas-microsoft-com:vml" xmlns:wp14="http://schemas.microsoft.com/office/word/2010/wordprocessingDrawing" xmlns:wp="http://schemas.openxmlformats.org/drawingml/2006/wordprocessingDrawing" xmlns:w10="urn:schemas-microsoft-com:office:word" xmlns:w="http://schemas.openxmlformats.org/wordprocessingml/2006/main" xmlns:w14="http://schemas.microsoft.com/office/word/2010/wordml" xmlns:w15="http://schemas.microsoft.com/office/word/2012/wordml" xmlns:w16cei="http://schemas.microsoft.com/office/word/2026/wordml/cei" xmlns:w16cex="http://schemas.microsoft.com/office/word/2018/wordml/cex" xmlns:w16cid="http://schemas.microsoft.com/office/word/2016/wordml/cid" xmlns:w16="http://schemas.microsoft.com/office/word/2018/wordml" xmlns:w16du="http://schemas.microsoft.com/office/word/2023/wordml/word16du" xmlns:w16sdtdh="http://schemas.microsoft.com/office/word/2020/wordml/sdtdatahash" xmlns:w16sdtfl="http://schemas.microsoft.com/office/word/2024/wordml/sdtformatlock" xmlns:w16se="http://schemas.microsoft.com/office/word/2015/wordml/symex" xmlns:wpg="http://schemas.microsoft.com/office/word/2010/wordprocessingGroup" xmlns:wpi="http://schemas.microsoft.com/office/word/2010/wordprocessingInk" xmlns:wne="http://schemas.microsoft.com/office/word/2006/wordml" xmlns:wps="http://schemas.microsoft.com/office/word/2010/wordprocessingShape" mc:Ignorable="w14 w15 w16se w16cid w16 w16cex w16sdtdh w16sdtfl w16du wp14">
+<w:hdr xmlns:wpc="http://schemas.microsoft.com/office/word/2010/wordprocessingCanvas" xmlns:cx="http://schemas.microsoft.com/office/drawing/2014/chartex" xmlns:cx1="http://schemas.microsoft.com/office/drawing/2015/9/8/chartex" xmlns:cx2="http://schemas.microsoft.com/office/drawing/2015/10/21/chartex" xmlns:cx3="http://schemas.microsoft.com/office/drawing/2016/5/9/chartex" xmlns:cx4="http://schemas.microsoft.com/office/drawing/2016/5/10/chartex" xmlns:cx5="http://schemas.microsoft.com/office/drawing/2016/5/11/chartex" xmlns:cx6="http://schemas.microsoft.com/office/drawing/2016/5/12/chartex" xmlns:cx7="http://schemas.microsoft.com/office/drawing/2016/5/13/chartex" xmlns:cx8="http://schemas.microsoft.com/office/drawing/2016/5/14/chartex" xmlns:mc="http://schemas.openxmlformats.org/markup-compatibility/2006" xmlns:aink="http://schemas.microsoft.com/office/drawing/2016/ink" xmlns:am3d="http://schemas.microsoft.com/office/drawing/2017/model3d" xmlns:o="urn:schemas-microsoft-com:office:office" xmlns:oel="http://schemas.microsoft.com/office/2019/extlst" xmlns:r="http://schemas.openxmlformats.org/officeDocument/2006/relationships" xmlns:m="http://schemas.openxmlformats.org/officeDocument/2006/math" xmlns:v="urn:schemas-microsoft-com:vml" xmlns:wp14="http://schemas.microsoft.com/office/word/2010/wordprocessingDrawing" xmlns:wp="http://schemas.openxmlformats.org/drawingml/2006/wordprocessingDrawing" xmlns:w10="urn:schemas-microsoft-com:office:word" xmlns:w="http://schemas.openxmlformats.org/wordprocessingml/2006/main" xmlns:w14="http://schemas.microsoft.com/office/word/2010/wordml" xmlns:w15="http://schemas.microsoft.com/office/word/2012/wordml" xmlns:w16cex="http://schemas.microsoft.com/office/word/2018/wordml/cex" xmlns:w16cid="http://schemas.microsoft.com/office/word/2016/wordml/cid" xmlns:w16="http://schemas.microsoft.com/office/word/2018/wordml" xmlns:w16du="http://schemas.microsoft.com/office/word/2023/wordml/word16du" xmlns:w16sdtdh="http://schemas.microsoft.com/office/word/2020/wordml/sdtdatahash" xmlns:w16sdtfl="http://schemas.microsoft.com/office/word/2024/wordml/sdtformatlock" xmlns:w16se="http://schemas.microsoft.com/office/word/2015/wordml/symex" xmlns:wpg="http://schemas.microsoft.com/office/word/2010/wordprocessingGroup" xmlns:wpi="http://schemas.microsoft.com/office/word/2010/wordprocessingInk" xmlns:wne="http://schemas.microsoft.com/office/word/2006/wordml" xmlns:wps="http://schemas.microsoft.com/office/word/2010/wordprocessingShape" mc:Ignorable="w14 w15 w16se w16cid w16 w16cex w16sdtdh w16sdtfl w16du wp14">
   <w:p>
     <w:pPr>
       <w:pStyle w:val="Encabezado"/>
@@ -2655,7 +4643,7 @@
 </file>
 
 <file path=word/header2.xml><?xml version="1.0" encoding="utf-8"?>
-<w:hdr xmlns:wpc="http://schemas.microsoft.com/office/word/2010/wordprocessingCanvas" xmlns:cx="http://schemas.microsoft.com/office/drawing/2014/chartex" xmlns:cx1="http://schemas.microsoft.com/office/drawing/2015/9/8/chartex" xmlns:cx2="http://schemas.microsoft.com/office/drawing/2015/10/21/chartex" xmlns:cx3="http://schemas.microsoft.com/office/drawing/2016/5/9/chartex" xmlns:cx4="http://schemas.microsoft.com/office/drawing/2016/5/10/chartex" xmlns:cx5="http://schemas.microsoft.com/office/drawing/2016/5/11/chartex" xmlns:cx6="http://schemas.microsoft.com/office/drawing/2016/5/12/chartex" xmlns:cx7="http://schemas.microsoft.com/office/drawing/2016/5/13/chartex" xmlns:cx8="http://schemas.microsoft.com/office/drawing/2016/5/14/chartex" xmlns:mc="http://schemas.openxmlformats.org/markup-compatibility/2006" xmlns:aink="http://schemas.microsoft.com/office/drawing/2016/ink" xmlns:am3d="http://schemas.microsoft.com/office/drawing/2017/model3d" xmlns:o="urn:schemas-microsoft-com:office:office" xmlns:oel="http://schemas.microsoft.com/office/2019/extlst" xmlns:r="http://schemas.openxmlformats.org/officeDocument/2006/relationships" xmlns:m="http://schemas.openxmlformats.org/officeDocument/2006/math" xmlns:v="urn:schemas-microsoft-com:vml" xmlns:wp14="http://schemas.microsoft.com/office/word/2010/wordprocessingDrawing" xmlns:wp="http://schemas.openxmlformats.org/drawingml/2006/wordprocessingDrawing" xmlns:w10="urn:schemas-microsoft-com:office:word" xmlns:w="http://schemas.openxmlformats.org/wordprocessingml/2006/main" xmlns:w14="http://schemas.microsoft.com/office/word/2010/wordml" xmlns:w15="http://schemas.microsoft.com/office/word/2012/wordml" xmlns:w16cei="http://schemas.microsoft.com/office/word/2026/wordml/cei" xmlns:w16cex="http://schemas.microsoft.com/office/word/2018/wordml/cex" xmlns:w16cid="http://schemas.microsoft.com/office/word/2016/wordml/cid" xmlns:w16="http://schemas.microsoft.com/office/word/2018/wordml" xmlns:w16du="http://schemas.microsoft.com/office/word/2023/wordml/word16du" xmlns:w16sdtdh="http://schemas.microsoft.com/office/word/2020/wordml/sdtdatahash" xmlns:w16sdtfl="http://schemas.microsoft.com/office/word/2024/wordml/sdtformatlock" xmlns:w16se="http://schemas.microsoft.com/office/word/2015/wordml/symex" xmlns:wpg="http://schemas.microsoft.com/office/word/2010/wordprocessingGroup" xmlns:wpi="http://schemas.microsoft.com/office/word/2010/wordprocessingInk" xmlns:wne="http://schemas.microsoft.com/office/word/2006/wordml" xmlns:wps="http://schemas.microsoft.com/office/word/2010/wordprocessingShape" mc:Ignorable="w14 w15 w16se w16cid w16 w16cex w16sdtdh w16sdtfl w16du wp14">
+<w:hdr xmlns:wpc="http://schemas.microsoft.com/office/word/2010/wordprocessingCanvas" xmlns:cx="http://schemas.microsoft.com/office/drawing/2014/chartex" xmlns:cx1="http://schemas.microsoft.com/office/drawing/2015/9/8/chartex" xmlns:cx2="http://schemas.microsoft.com/office/drawing/2015/10/21/chartex" xmlns:cx3="http://schemas.microsoft.com/office/drawing/2016/5/9/chartex" xmlns:cx4="http://schemas.microsoft.com/office/drawing/2016/5/10/chartex" xmlns:cx5="http://schemas.microsoft.com/office/drawing/2016/5/11/chartex" xmlns:cx6="http://schemas.microsoft.com/office/drawing/2016/5/12/chartex" xmlns:cx7="http://schemas.microsoft.com/office/drawing/2016/5/13/chartex" xmlns:cx8="http://schemas.microsoft.com/office/drawing/2016/5/14/chartex" xmlns:mc="http://schemas.openxmlformats.org/markup-compatibility/2006" xmlns:aink="http://schemas.microsoft.com/office/drawing/2016/ink" xmlns:am3d="http://schemas.microsoft.com/office/drawing/2017/model3d" xmlns:o="urn:schemas-microsoft-com:office:office" xmlns:oel="http://schemas.microsoft.com/office/2019/extlst" xmlns:r="http://schemas.openxmlformats.org/officeDocument/2006/relationships" xmlns:m="http://schemas.openxmlformats.org/officeDocument/2006/math" xmlns:v="urn:schemas-microsoft-com:vml" xmlns:wp14="http://schemas.microsoft.com/office/word/2010/wordprocessingDrawing" xmlns:wp="http://schemas.openxmlformats.org/drawingml/2006/wordprocessingDrawing" xmlns:w10="urn:schemas-microsoft-com:office:word" xmlns:w="http://schemas.openxmlformats.org/wordprocessingml/2006/main" xmlns:w14="http://schemas.microsoft.com/office/word/2010/wordml" xmlns:w15="http://schemas.microsoft.com/office/word/2012/wordml" xmlns:w16cex="http://schemas.microsoft.com/office/word/2018/wordml/cex" xmlns:w16cid="http://schemas.microsoft.com/office/word/2016/wordml/cid" xmlns:w16="http://schemas.microsoft.com/office/word/2018/wordml" xmlns:w16du="http://schemas.microsoft.com/office/word/2023/wordml/word16du" xmlns:w16sdtdh="http://schemas.microsoft.com/office/word/2020/wordml/sdtdatahash" xmlns:w16sdtfl="http://schemas.microsoft.com/office/word/2024/wordml/sdtformatlock" xmlns:w16se="http://schemas.microsoft.com/office/word/2015/wordml/symex" xmlns:wpg="http://schemas.microsoft.com/office/word/2010/wordprocessingGroup" xmlns:wpi="http://schemas.microsoft.com/office/word/2010/wordprocessingInk" xmlns:wne="http://schemas.microsoft.com/office/word/2006/wordml" xmlns:wps="http://schemas.microsoft.com/office/word/2010/wordprocessingShape" mc:Ignorable="w14 w15 w16se w16cid w16 w16cex w16sdtdh w16sdtfl w16du wp14">
   <w:tbl>
     <w:tblPr>
       <w:tblStyle w:val="Tablaconcuadrcula"/>
@@ -2816,7 +4804,7 @@
 </file>
 
 <file path=word/header3.xml><?xml version="1.0" encoding="utf-8"?>
-<w:hdr xmlns:wpc="http://schemas.microsoft.com/office/word/2010/wordprocessingCanvas" xmlns:cx="http://schemas.microsoft.com/office/drawing/2014/chartex" xmlns:cx1="http://schemas.microsoft.com/office/drawing/2015/9/8/chartex" xmlns:cx2="http://schemas.microsoft.com/office/drawing/2015/10/21/chartex" xmlns:cx3="http://schemas.microsoft.com/office/drawing/2016/5/9/chartex" xmlns:cx4="http://schemas.microsoft.com/office/drawing/2016/5/10/chartex" xmlns:cx5="http://schemas.microsoft.com/office/drawing/2016/5/11/chartex" xmlns:cx6="http://schemas.microsoft.com/office/drawing/2016/5/12/chartex" xmlns:cx7="http://schemas.microsoft.com/office/drawing/2016/5/13/chartex" xmlns:cx8="http://schemas.microsoft.com/office/drawing/2016/5/14/chartex" xmlns:mc="http://schemas.openxmlformats.org/markup-compatibility/2006" xmlns:aink="http://schemas.microsoft.com/office/drawing/2016/ink" xmlns:am3d="http://schemas.microsoft.com/office/drawing/2017/model3d" xmlns:o="urn:schemas-microsoft-com:office:office" xmlns:oel="http://schemas.microsoft.com/office/2019/extlst" xmlns:r="http://schemas.openxmlformats.org/officeDocument/2006/relationships" xmlns:m="http://schemas.openxmlformats.org/officeDocument/2006/math" xmlns:v="urn:schemas-microsoft-com:vml" xmlns:wp14="http://schemas.microsoft.com/office/word/2010/wordprocessingDrawing" xmlns:wp="http://schemas.openxmlformats.org/drawingml/2006/wordprocessingDrawing" xmlns:w10="urn:schemas-microsoft-com:office:word" xmlns:w="http://schemas.openxmlformats.org/wordprocessingml/2006/main" xmlns:w14="http://schemas.microsoft.com/office/word/2010/wordml" xmlns:w15="http://schemas.microsoft.com/office/word/2012/wordml" xmlns:w16cei="http://schemas.microsoft.com/office/word/2026/wordml/cei" xmlns:w16cex="http://schemas.microsoft.com/office/word/2018/wordml/cex" xmlns:w16cid="http://schemas.microsoft.com/office/word/2016/wordml/cid" xmlns:w16="http://schemas.microsoft.com/office/word/2018/wordml" xmlns:w16du="http://schemas.microsoft.com/office/word/2023/wordml/word16du" xmlns:w16sdtdh="http://schemas.microsoft.com/office/word/2020/wordml/sdtdatahash" xmlns:w16sdtfl="http://schemas.microsoft.com/office/word/2024/wordml/sdtformatlock" xmlns:w16se="http://schemas.microsoft.com/office/word/2015/wordml/symex" xmlns:wpg="http://schemas.microsoft.com/office/word/2010/wordprocessingGroup" xmlns:wpi="http://schemas.microsoft.com/office/word/2010/wordprocessingInk" xmlns:wne="http://schemas.microsoft.com/office/word/2006/wordml" xmlns:wps="http://schemas.microsoft.com/office/word/2010/wordprocessingShape" mc:Ignorable="w14 w15 w16se w16cid w16 w16cex w16sdtdh w16sdtfl w16du wp14">
+<w:hdr xmlns:wpc="http://schemas.microsoft.com/office/word/2010/wordprocessingCanvas" xmlns:cx="http://schemas.microsoft.com/office/drawing/2014/chartex" xmlns:cx1="http://schemas.microsoft.com/office/drawing/2015/9/8/chartex" xmlns:cx2="http://schemas.microsoft.com/office/drawing/2015/10/21/chartex" xmlns:cx3="http://schemas.microsoft.com/office/drawing/2016/5/9/chartex" xmlns:cx4="http://schemas.microsoft.com/office/drawing/2016/5/10/chartex" xmlns:cx5="http://schemas.microsoft.com/office/drawing/2016/5/11/chartex" xmlns:cx6="http://schemas.microsoft.com/office/drawing/2016/5/12/chartex" xmlns:cx7="http://schemas.microsoft.com/office/drawing/2016/5/13/chartex" xmlns:cx8="http://schemas.microsoft.com/office/drawing/2016/5/14/chartex" xmlns:mc="http://schemas.openxmlformats.org/markup-compatibility/2006" xmlns:aink="http://schemas.microsoft.com/office/drawing/2016/ink" xmlns:am3d="http://schemas.microsoft.com/office/drawing/2017/model3d" xmlns:o="urn:schemas-microsoft-com:office:office" xmlns:oel="http://schemas.microsoft.com/office/2019/extlst" xmlns:r="http://schemas.openxmlformats.org/officeDocument/2006/relationships" xmlns:m="http://schemas.openxmlformats.org/officeDocument/2006/math" xmlns:v="urn:schemas-microsoft-com:vml" xmlns:wp14="http://schemas.microsoft.com/office/word/2010/wordprocessingDrawing" xmlns:wp="http://schemas.openxmlformats.org/drawingml/2006/wordprocessingDrawing" xmlns:w10="urn:schemas-microsoft-com:office:word" xmlns:w="http://schemas.openxmlformats.org/wordprocessingml/2006/main" xmlns:w14="http://schemas.microsoft.com/office/word/2010/wordml" xmlns:w15="http://schemas.microsoft.com/office/word/2012/wordml" xmlns:w16cex="http://schemas.microsoft.com/office/word/2018/wordml/cex" xmlns:w16cid="http://schemas.microsoft.com/office/word/2016/wordml/cid" xmlns:w16="http://schemas.microsoft.com/office/word/2018/wordml" xmlns:w16du="http://schemas.microsoft.com/office/word/2023/wordml/word16du" xmlns:w16sdtdh="http://schemas.microsoft.com/office/word/2020/wordml/sdtdatahash" xmlns:w16sdtfl="http://schemas.microsoft.com/office/word/2024/wordml/sdtformatlock" xmlns:w16se="http://schemas.microsoft.com/office/word/2015/wordml/symex" xmlns:wpg="http://schemas.microsoft.com/office/word/2010/wordprocessingGroup" xmlns:wpi="http://schemas.microsoft.com/office/word/2010/wordprocessingInk" xmlns:wne="http://schemas.microsoft.com/office/word/2006/wordml" xmlns:wps="http://schemas.microsoft.com/office/word/2010/wordprocessingShape" mc:Ignorable="w14 w15 w16se w16cid w16 w16cex w16sdtdh w16sdtfl w16du wp14">
   <w:tbl>
     <w:tblPr>
       <w:tblStyle w:val="Tablaconcuadrcula"/>
@@ -3107,7 +5095,7 @@
 </file>
 
 <file path=word/numbering.xml><?xml version="1.0" encoding="utf-8"?>
-<w:numbering xmlns:wpc="http://schemas.microsoft.com/office/word/2010/wordprocessingCanvas" xmlns:cx="http://schemas.microsoft.com/office/drawing/2014/chartex" xmlns:cx1="http://schemas.microsoft.com/office/drawing/2015/9/8/chartex" xmlns:cx2="http://schemas.microsoft.com/office/drawing/2015/10/21/chartex" xmlns:cx3="http://schemas.microsoft.com/office/drawing/2016/5/9/chartex" xmlns:cx4="http://schemas.microsoft.com/office/drawing/2016/5/10/chartex" xmlns:cx5="http://schemas.microsoft.com/office/drawing/2016/5/11/chartex" xmlns:cx6="http://schemas.microsoft.com/office/drawing/2016/5/12/chartex" xmlns:cx7="http://schemas.microsoft.com/office/drawing/2016/5/13/chartex" xmlns:cx8="http://schemas.microsoft.com/office/drawing/2016/5/14/chartex" xmlns:mc="http://schemas.openxmlformats.org/markup-compatibility/2006" xmlns:aink="http://schemas.microsoft.com/office/drawing/2016/ink" xmlns:am3d="http://schemas.microsoft.com/office/drawing/2017/model3d" xmlns:o="urn:schemas-microsoft-com:office:office" xmlns:oel="http://schemas.microsoft.com/office/2019/extlst" xmlns:r="http://schemas.openxmlformats.org/officeDocument/2006/relationships" xmlns:m="http://schemas.openxmlformats.org/officeDocument/2006/math" xmlns:v="urn:schemas-microsoft-com:vml" xmlns:wp14="http://schemas.microsoft.com/office/word/2010/wordprocessingDrawing" xmlns:wp="http://schemas.openxmlformats.org/drawingml/2006/wordprocessingDrawing" xmlns:w10="urn:schemas-microsoft-com:office:word" xmlns:w="http://schemas.openxmlformats.org/wordprocessingml/2006/main" xmlns:w14="http://schemas.microsoft.com/office/word/2010/wordml" xmlns:w15="http://schemas.microsoft.com/office/word/2012/wordml" xmlns:w16cei="http://schemas.microsoft.com/office/word/2026/wordml/cei" xmlns:w16cex="http://schemas.microsoft.com/office/word/2018/wordml/cex" xmlns:w16cid="http://schemas.microsoft.com/office/word/2016/wordml/cid" xmlns:w16="http://schemas.microsoft.com/office/word/2018/wordml" xmlns:w16du="http://schemas.microsoft.com/office/word/2023/wordml/word16du" xmlns:w16sdtdh="http://schemas.microsoft.com/office/word/2020/wordml/sdtdatahash" xmlns:w16sdtfl="http://schemas.microsoft.com/office/word/2024/wordml/sdtformatlock" xmlns:w16se="http://schemas.microsoft.com/office/word/2015/wordml/symex" xmlns:wpg="http://schemas.microsoft.com/office/word/2010/wordprocessingGroup" xmlns:wpi="http://schemas.microsoft.com/office/word/2010/wordprocessingInk" xmlns:wne="http://schemas.microsoft.com/office/word/2006/wordml" xmlns:wps="http://schemas.microsoft.com/office/word/2010/wordprocessingShape" mc:Ignorable="w14 w15 w16se w16cid w16 w16cex w16sdtdh w16sdtfl w16du wp14">
+<w:numbering xmlns:wpc="http://schemas.microsoft.com/office/word/2010/wordprocessingCanvas" xmlns:cx="http://schemas.microsoft.com/office/drawing/2014/chartex" xmlns:cx1="http://schemas.microsoft.com/office/drawing/2015/9/8/chartex" xmlns:cx2="http://schemas.microsoft.com/office/drawing/2015/10/21/chartex" xmlns:cx3="http://schemas.microsoft.com/office/drawing/2016/5/9/chartex" xmlns:cx4="http://schemas.microsoft.com/office/drawing/2016/5/10/chartex" xmlns:cx5="http://schemas.microsoft.com/office/drawing/2016/5/11/chartex" xmlns:cx6="http://schemas.microsoft.com/office/drawing/2016/5/12/chartex" xmlns:cx7="http://schemas.microsoft.com/office/drawing/2016/5/13/chartex" xmlns:cx8="http://schemas.microsoft.com/office/drawing/2016/5/14/chartex" xmlns:mc="http://schemas.openxmlformats.org/markup-compatibility/2006" xmlns:aink="http://schemas.microsoft.com/office/drawing/2016/ink" xmlns:am3d="http://schemas.microsoft.com/office/drawing/2017/model3d" xmlns:o="urn:schemas-microsoft-com:office:office" xmlns:oel="http://schemas.microsoft.com/office/2019/extlst" xmlns:r="http://schemas.openxmlformats.org/officeDocument/2006/relationships" xmlns:m="http://schemas.openxmlformats.org/officeDocument/2006/math" xmlns:v="urn:schemas-microsoft-com:vml" xmlns:wp14="http://schemas.microsoft.com/office/word/2010/wordprocessingDrawing" xmlns:wp="http://schemas.openxmlformats.org/drawingml/2006/wordprocessingDrawing" xmlns:w10="urn:schemas-microsoft-com:office:word" xmlns:w="http://schemas.openxmlformats.org/wordprocessingml/2006/main" xmlns:w14="http://schemas.microsoft.com/office/word/2010/wordml" xmlns:w15="http://schemas.microsoft.com/office/word/2012/wordml" xmlns:w16cex="http://schemas.microsoft.com/office/word/2018/wordml/cex" xmlns:w16cid="http://schemas.microsoft.com/office/word/2016/wordml/cid" xmlns:w16="http://schemas.microsoft.com/office/word/2018/wordml" xmlns:w16du="http://schemas.microsoft.com/office/word/2023/wordml/word16du" xmlns:w16sdtdh="http://schemas.microsoft.com/office/word/2020/wordml/sdtdatahash" xmlns:w16sdtfl="http://schemas.microsoft.com/office/word/2024/wordml/sdtformatlock" xmlns:w16se="http://schemas.microsoft.com/office/word/2015/wordml/symex" xmlns:wpg="http://schemas.microsoft.com/office/word/2010/wordprocessingGroup" xmlns:wpi="http://schemas.microsoft.com/office/word/2010/wordprocessingInk" xmlns:wne="http://schemas.microsoft.com/office/word/2006/wordml" xmlns:wps="http://schemas.microsoft.com/office/word/2010/wordprocessingShape" mc:Ignorable="w14 w15 w16se w16cid w16 w16cex w16sdtdh w16sdtfl w16du wp14">
   <w:abstractNum w:abstractNumId="0" w15:restartNumberingAfterBreak="0">
     <w:nsid w:val="049156A1"/>
     <w:multiLevelType w:val="hybridMultilevel"/>
@@ -8387,7 +10375,6 @@
   <w:style w:type="character" w:default="1" w:styleId="Fuentedeprrafopredeter">
     <w:name w:val="Default Paragraph Font"/>
     <w:uiPriority w:val="1"/>
-    <w:semiHidden/>
     <w:unhideWhenUsed/>
   </w:style>
   <w:style w:type="table" w:default="1" w:styleId="Tablanormal">
@@ -9423,6 +11410,17 @@
       </w:tcPr>
     </w:tblStylePr>
   </w:style>
+  <w:style w:type="character" w:customStyle="1" w:styleId="A15">
+    <w:name w:val="A15"/>
+    <w:uiPriority w:val="99"/>
+    <w:rsid w:val="007A7618"/>
+    <w:rPr>
+      <w:rFonts w:cs="Lato"/>
+      <w:color w:val="000000"/>
+      <w:sz w:val="15"/>
+      <w:szCs w:val="15"/>
+    </w:rPr>
+  </w:style>
 </w:styles>
 </file>
 
@@ -9688,7 +11686,9 @@
 </file>
 
 <file path=customXml/item1.xml><?xml version="1.0" encoding="utf-8"?>
-<b:Sources xmlns:b="http://schemas.openxmlformats.org/officeDocument/2006/bibliography" xmlns="http://schemas.openxmlformats.org/officeDocument/2006/bibliography" SelectedStyle="\APASixthEditionOfficeOnline.xsl" StyleName="APA" Version="6"/>
+<p:properties xmlns:p="http://schemas.microsoft.com/office/2006/metadata/properties" xmlns:xsi="http://www.w3.org/2001/XMLSchema-instance" xmlns:pc="http://schemas.microsoft.com/office/infopath/2007/PartnerControls">
+  <documentManagement/>
+</p:properties>
 </file>
 
 <file path=customXml/item2.xml><?xml version="1.0" encoding="utf-8"?>
@@ -9824,9 +11824,7 @@
 </file>
 
 <file path=customXml/item3.xml><?xml version="1.0" encoding="utf-8"?>
-<p:properties xmlns:p="http://schemas.microsoft.com/office/2006/metadata/properties" xmlns:xsi="http://www.w3.org/2001/XMLSchema-instance" xmlns:pc="http://schemas.microsoft.com/office/infopath/2007/PartnerControls">
-  <documentManagement/>
-</p:properties>
+<b:Sources xmlns:b="http://schemas.openxmlformats.org/officeDocument/2006/bibliography" xmlns="http://schemas.openxmlformats.org/officeDocument/2006/bibliography" SelectedStyle="\APASixthEditionOfficeOnline.xsl" StyleName="APA" Version="6"/>
 </file>
 
 <file path=customXml/item4.xml><?xml version="1.0" encoding="utf-8"?>
@@ -9839,9 +11837,10 @@
 </file>
 
 <file path=customXml/itemProps1.xml><?xml version="1.0" encoding="utf-8"?>
-<ds:datastoreItem xmlns:ds="http://schemas.openxmlformats.org/officeDocument/2006/customXml" ds:itemID="{6E8A10B9-B765-4F0B-A47F-7CB788CD8F65}">
+<ds:datastoreItem xmlns:ds="http://schemas.openxmlformats.org/officeDocument/2006/customXml" ds:itemID="{5F1783E3-BA1C-4CA3-8E32-C9B378BBED03}">
   <ds:schemaRefs>
-    <ds:schemaRef ds:uri="http://schemas.openxmlformats.org/officeDocument/2006/bibliography"/>
+    <ds:schemaRef ds:uri="http://schemas.microsoft.com/office/2006/metadata/properties"/>
+    <ds:schemaRef ds:uri="http://schemas.microsoft.com/office/infopath/2007/PartnerControls"/>
   </ds:schemaRefs>
 </ds:datastoreItem>
 </file>
@@ -9865,10 +11864,9 @@
 </file>
 
 <file path=customXml/itemProps3.xml><?xml version="1.0" encoding="utf-8"?>
-<ds:datastoreItem xmlns:ds="http://schemas.openxmlformats.org/officeDocument/2006/customXml" ds:itemID="{5F1783E3-BA1C-4CA3-8E32-C9B378BBED03}">
+<ds:datastoreItem xmlns:ds="http://schemas.openxmlformats.org/officeDocument/2006/customXml" ds:itemID="{6E8A10B9-B765-4F0B-A47F-7CB788CD8F65}">
   <ds:schemaRefs>
-    <ds:schemaRef ds:uri="http://schemas.microsoft.com/office/2006/metadata/properties"/>
-    <ds:schemaRef ds:uri="http://schemas.microsoft.com/office/infopath/2007/PartnerControls"/>
+    <ds:schemaRef ds:uri="http://schemas.openxmlformats.org/officeDocument/2006/bibliography"/>
   </ds:schemaRefs>
 </ds:datastoreItem>
 </file>

</xml_diff>